<commit_message>
QA docs: buddy dock and update-banner test cases (81 cases)
Co-Authored-By: Claude Fable 5.1 <noreply@anthropic.com>
</commit_message>
<xml_diff>
--- a/docs/qa/Teach — тестовая документация QA.docx
+++ b/docs/qa/Teach — тестовая документация QA.docx
@@ -1422,7 +1422,7 @@
               <w:rPr>
                 <w:sz w:val="19"/>
               </w:rPr>
-              <w:t>Четыре шага, проверка ответов, разбор с записями, возврат на «Сегодня», карточка «Пройдено сегодня»</w:t>
+              <w:t>Четыре шага, проверка ответов, над кнопкой карточка бадди меняет слово («Читайте» → «Ваш ход» → «Верно»/«Не совсем»), разбор с записями, возврат на «Сегодня», карточка «Пройдено сегодня»</w:t>
             </w:r>
           </w:p>
         </w:tc>
@@ -3213,6 +3213,145 @@
           </w:p>
         </w:tc>
       </w:tr>
+      <w:tr>
+        <w:tc>
+          <w:tcPr>
+            <w:tcW w:type="dxa" w:w="794"/>
+          </w:tcPr>
+          <w:p>
+            <w:pPr>
+              <w:spacing w:after="20"/>
+            </w:pPr>
+            <w:r/>
+            <w:r>
+              <w:rPr>
+                <w:sz w:val="18"/>
+              </w:rPr>
+              <w:t>B-06</w:t>
+            </w:r>
+          </w:p>
+        </w:tc>
+        <w:tc>
+          <w:tcPr>
+            <w:tcW w:type="dxa" w:w="1587"/>
+          </w:tcPr>
+          <w:p>
+            <w:pPr>
+              <w:spacing w:after="20"/>
+            </w:pPr>
+            <w:r/>
+            <w:r>
+              <w:rPr>
+                <w:sz w:val="18"/>
+              </w:rPr>
+              <w:t>Подсказка «есть новая версия»</w:t>
+            </w:r>
+          </w:p>
+        </w:tc>
+        <w:tc>
+          <w:tcPr>
+            <w:tcW w:type="dxa" w:w="1587"/>
+          </w:tcPr>
+          <w:p>
+            <w:pPr>
+              <w:spacing w:after="20"/>
+            </w:pPr>
+            <w:r/>
+            <w:r>
+              <w:rPr>
+                <w:sz w:val="18"/>
+              </w:rPr>
+              <w:t>На сервере задана сборка новее установленной (уточните у разработчика номер последней выложенной сборки; сравните с номером в TestFlight)</w:t>
+            </w:r>
+          </w:p>
+        </w:tc>
+        <w:tc>
+          <w:tcPr>
+            <w:tcW w:type="dxa" w:w="3061"/>
+          </w:tcPr>
+          <w:p>
+            <w:pPr>
+              <w:spacing w:after="20"/>
+            </w:pPr>
+            <w:r/>
+            <w:r>
+              <w:rPr>
+                <w:sz w:val="18"/>
+              </w:rPr>
+              <w:t>1. Запустить приложение, открыть «Сегодня»</w:t>
+            </w:r>
+          </w:p>
+          <w:p>
+            <w:pPr>
+              <w:spacing w:after="20"/>
+            </w:pPr>
+            <w:r>
+              <w:rPr>
+                <w:sz w:val="18"/>
+              </w:rPr>
+              <w:t>2. Нажать «Обновить»</w:t>
+            </w:r>
+          </w:p>
+          <w:p>
+            <w:pPr>
+              <w:spacing w:after="20"/>
+            </w:pPr>
+            <w:r>
+              <w:rPr>
+                <w:sz w:val="18"/>
+              </w:rPr>
+              <w:t>3. Вернуться, нажать ×</w:t>
+            </w:r>
+          </w:p>
+          <w:p>
+            <w:pPr>
+              <w:spacing w:after="20"/>
+            </w:pPr>
+            <w:r>
+              <w:rPr>
+                <w:sz w:val="18"/>
+              </w:rPr>
+              <w:t>4. Перезапустить приложение</w:t>
+            </w:r>
+          </w:p>
+        </w:tc>
+        <w:tc>
+          <w:tcPr>
+            <w:tcW w:type="dxa" w:w="2381"/>
+          </w:tcPr>
+          <w:p>
+            <w:pPr>
+              <w:spacing w:after="20"/>
+            </w:pPr>
+            <w:r/>
+            <w:r>
+              <w:rPr>
+                <w:sz w:val="18"/>
+              </w:rPr>
+              <w:t>Под шапкой песочная карточка «Есть сборка N · Обновите приложение в TestFlight», кнопка «Обновить» и ×; «Обновить» открывает TestFlight; × прячет карточку до следующего запуска; после перезапуска она снова на месте; если установлена последняя сборка, карточки нет; без сети карточки нет и ошибок нет</w:t>
+            </w:r>
+          </w:p>
+        </w:tc>
+        <w:tc>
+          <w:tcPr>
+            <w:tcW w:type="dxa" w:w="794"/>
+          </w:tcPr>
+          <w:p>
+            <w:pPr>
+              <w:spacing w:after="20"/>
+            </w:pPr>
+            <w:r/>
+            <w:r>
+              <w:rPr>
+                <w:sz w:val="18"/>
+              </w:rPr>
+              <w:t>☐ PASS</w:t>
+              <w:br/>
+              <w:t>☐ FAIL</w:t>
+            </w:r>
+          </w:p>
+        </w:tc>
+      </w:tr>
     </w:tbl>
     <w:p>
       <w:pPr>
@@ -5594,6 +5733,668 @@
                 <w:sz w:val="18"/>
               </w:rPr>
               <w:t>Прокрутка работает; случайные диагональные движения не переключают шаг</w:t>
+            </w:r>
+          </w:p>
+        </w:tc>
+        <w:tc>
+          <w:tcPr>
+            <w:tcW w:type="dxa" w:w="794"/>
+          </w:tcPr>
+          <w:p>
+            <w:pPr>
+              <w:spacing w:after="20"/>
+            </w:pPr>
+            <w:r/>
+            <w:r>
+              <w:rPr>
+                <w:sz w:val="18"/>
+              </w:rPr>
+              <w:t>☐ PASS</w:t>
+              <w:br/>
+              <w:t>☐ FAIL</w:t>
+            </w:r>
+          </w:p>
+        </w:tc>
+      </w:tr>
+      <w:tr>
+        <w:tc>
+          <w:tcPr>
+            <w:tcW w:type="dxa" w:w="794"/>
+          </w:tcPr>
+          <w:p>
+            <w:pPr>
+              <w:spacing w:after="20"/>
+            </w:pPr>
+            <w:r/>
+            <w:r>
+              <w:rPr>
+                <w:sz w:val="18"/>
+              </w:rPr>
+              <w:t>D-11</w:t>
+            </w:r>
+          </w:p>
+        </w:tc>
+        <w:tc>
+          <w:tcPr>
+            <w:tcW w:type="dxa" w:w="1587"/>
+          </w:tcPr>
+          <w:p>
+            <w:pPr>
+              <w:spacing w:after="20"/>
+            </w:pPr>
+            <w:r/>
+            <w:r>
+              <w:rPr>
+                <w:sz w:val="18"/>
+              </w:rPr>
+              <w:t>Бадди: слово хода</w:t>
+            </w:r>
+          </w:p>
+        </w:tc>
+        <w:tc>
+          <w:tcPr>
+            <w:tcW w:type="dxa" w:w="1587"/>
+          </w:tcPr>
+          <w:p>
+            <w:pPr>
+              <w:spacing w:after="20"/>
+            </w:pPr>
+            <w:r/>
+            <w:r>
+              <w:rPr>
+                <w:sz w:val="18"/>
+              </w:rPr>
+              <w:t>Любой урок</w:t>
+            </w:r>
+          </w:p>
+        </w:tc>
+        <w:tc>
+          <w:tcPr>
+            <w:tcW w:type="dxa" w:w="3061"/>
+          </w:tcPr>
+          <w:p>
+            <w:pPr>
+              <w:spacing w:after="20"/>
+            </w:pPr>
+            <w:r/>
+            <w:r>
+              <w:rPr>
+                <w:sz w:val="18"/>
+              </w:rPr>
+              <w:t>1. Посмотреть на строку над главной кнопкой на шаге объяснения</w:t>
+            </w:r>
+          </w:p>
+          <w:p>
+            <w:pPr>
+              <w:spacing w:after="20"/>
+            </w:pPr>
+            <w:r>
+              <w:rPr>
+                <w:sz w:val="18"/>
+              </w:rPr>
+              <w:t>2. Перейти к практике</w:t>
+            </w:r>
+          </w:p>
+          <w:p>
+            <w:pPr>
+              <w:spacing w:after="20"/>
+            </w:pPr>
+            <w:r>
+              <w:rPr>
+                <w:sz w:val="18"/>
+              </w:rPr>
+              <w:t>3. Свайпнуть назад на пройденный шаг</w:t>
+            </w:r>
+          </w:p>
+        </w:tc>
+        <w:tc>
+          <w:tcPr>
+            <w:tcW w:type="dxa" w:w="2381"/>
+          </w:tcPr>
+          <w:p>
+            <w:pPr>
+              <w:spacing w:after="20"/>
+            </w:pPr>
+            <w:r/>
+            <w:r>
+              <w:rPr>
+                <w:sz w:val="18"/>
+              </w:rPr>
+              <w:t>Над кнопкой всегда есть карточка с четырьмя точками знака (последняя — янтарное кольцо) и словом: на объяснении «Читайте» (точки неподвижны), на практике «Ваш ход» (точки медленно «дышат»), на пройденном шаге снова «Читайте». Высота карточки не меняется при смене слова</w:t>
+            </w:r>
+          </w:p>
+        </w:tc>
+        <w:tc>
+          <w:tcPr>
+            <w:tcW w:type="dxa" w:w="794"/>
+          </w:tcPr>
+          <w:p>
+            <w:pPr>
+              <w:spacing w:after="20"/>
+            </w:pPr>
+            <w:r/>
+            <w:r>
+              <w:rPr>
+                <w:sz w:val="18"/>
+              </w:rPr>
+              <w:t>☐ PASS</w:t>
+              <w:br/>
+              <w:t>☐ FAIL</w:t>
+            </w:r>
+          </w:p>
+        </w:tc>
+      </w:tr>
+      <w:tr>
+        <w:tc>
+          <w:tcPr>
+            <w:tcW w:type="dxa" w:w="794"/>
+          </w:tcPr>
+          <w:p>
+            <w:pPr>
+              <w:spacing w:after="20"/>
+            </w:pPr>
+            <w:r/>
+            <w:r>
+              <w:rPr>
+                <w:sz w:val="18"/>
+              </w:rPr>
+              <w:t>D-12</w:t>
+            </w:r>
+          </w:p>
+        </w:tc>
+        <w:tc>
+          <w:tcPr>
+            <w:tcW w:type="dxa" w:w="1587"/>
+          </w:tcPr>
+          <w:p>
+            <w:pPr>
+              <w:spacing w:after="20"/>
+            </w:pPr>
+            <w:r/>
+            <w:r>
+              <w:rPr>
+                <w:sz w:val="18"/>
+              </w:rPr>
+              <w:t>Бадди: слушаю, читаю пример, думаю</w:t>
+            </w:r>
+          </w:p>
+        </w:tc>
+        <w:tc>
+          <w:tcPr>
+            <w:tcW w:type="dxa" w:w="1587"/>
+          </w:tcPr>
+          <w:p>
+            <w:pPr>
+              <w:spacing w:after="20"/>
+            </w:pPr>
+            <w:r/>
+            <w:r>
+              <w:rPr>
+                <w:sz w:val="18"/>
+              </w:rPr>
+              <w:t>Шаг с полем ввода языкового предмета, голос включён</w:t>
+            </w:r>
+          </w:p>
+        </w:tc>
+        <w:tc>
+          <w:tcPr>
+            <w:tcW w:type="dxa" w:w="3061"/>
+          </w:tcPr>
+          <w:p>
+            <w:pPr>
+              <w:spacing w:after="20"/>
+            </w:pPr>
+            <w:r/>
+            <w:r>
+              <w:rPr>
+                <w:sz w:val="18"/>
+              </w:rPr>
+              <w:t>1. Нажать микрофон (или удерживать в режиме «Удерживать»)</w:t>
+            </w:r>
+          </w:p>
+          <w:p>
+            <w:pPr>
+              <w:spacing w:after="20"/>
+            </w:pPr>
+            <w:r>
+              <w:rPr>
+                <w:sz w:val="18"/>
+              </w:rPr>
+              <w:t>2. Остановить запись</w:t>
+            </w:r>
+          </w:p>
+          <w:p>
+            <w:pPr>
+              <w:spacing w:after="20"/>
+            </w:pPr>
+            <w:r>
+              <w:rPr>
+                <w:sz w:val="18"/>
+              </w:rPr>
+              <w:t>3. Нажать динамик у примера</w:t>
+            </w:r>
+          </w:p>
+          <w:p>
+            <w:pPr>
+              <w:spacing w:after="20"/>
+            </w:pPr>
+            <w:r>
+              <w:rPr>
+                <w:sz w:val="18"/>
+              </w:rPr>
+              <w:t>4. На шаге «напишите 2–3 фразы» нажать «Ответить»</w:t>
+            </w:r>
+          </w:p>
+        </w:tc>
+        <w:tc>
+          <w:tcPr>
+            <w:tcW w:type="dxa" w:w="2381"/>
+          </w:tcPr>
+          <w:p>
+            <w:pPr>
+              <w:spacing w:after="20"/>
+            </w:pPr>
+            <w:r/>
+            <w:r>
+              <w:rPr>
+                <w:sz w:val="18"/>
+              </w:rPr>
+              <w:t>Во время записи слово «Слушаю», точки тянутся вверх как эквалайзер; после остановки «Ваш ход»; во время озвучки «Читаю пример», по ряду бежит волна, по окончании прежнее слово; пока сервер оценивает свободный ответ — «Думаю», точки сходятся к центру</w:t>
+            </w:r>
+          </w:p>
+        </w:tc>
+        <w:tc>
+          <w:tcPr>
+            <w:tcW w:type="dxa" w:w="794"/>
+          </w:tcPr>
+          <w:p>
+            <w:pPr>
+              <w:spacing w:after="20"/>
+            </w:pPr>
+            <w:r/>
+            <w:r>
+              <w:rPr>
+                <w:sz w:val="18"/>
+              </w:rPr>
+              <w:t>☐ PASS</w:t>
+              <w:br/>
+              <w:t>☐ FAIL</w:t>
+            </w:r>
+          </w:p>
+        </w:tc>
+      </w:tr>
+      <w:tr>
+        <w:tc>
+          <w:tcPr>
+            <w:tcW w:type="dxa" w:w="794"/>
+          </w:tcPr>
+          <w:p>
+            <w:pPr>
+              <w:spacing w:after="20"/>
+            </w:pPr>
+            <w:r/>
+            <w:r>
+              <w:rPr>
+                <w:sz w:val="18"/>
+              </w:rPr>
+              <w:t>D-13</w:t>
+            </w:r>
+          </w:p>
+        </w:tc>
+        <w:tc>
+          <w:tcPr>
+            <w:tcW w:type="dxa" w:w="1587"/>
+          </w:tcPr>
+          <w:p>
+            <w:pPr>
+              <w:spacing w:after="20"/>
+            </w:pPr>
+            <w:r/>
+            <w:r>
+              <w:rPr>
+                <w:sz w:val="18"/>
+              </w:rPr>
+              <w:t>Бадди: реакция на ответ</w:t>
+            </w:r>
+          </w:p>
+        </w:tc>
+        <w:tc>
+          <w:tcPr>
+            <w:tcW w:type="dxa" w:w="1587"/>
+          </w:tcPr>
+          <w:p>
+            <w:pPr>
+              <w:spacing w:after="20"/>
+            </w:pPr>
+            <w:r/>
+            <w:r>
+              <w:rPr>
+                <w:sz w:val="18"/>
+              </w:rPr>
+              <w:t>Шаг с вариантами и шаг с полем ввода</w:t>
+            </w:r>
+          </w:p>
+        </w:tc>
+        <w:tc>
+          <w:tcPr>
+            <w:tcW w:type="dxa" w:w="3061"/>
+          </w:tcPr>
+          <w:p>
+            <w:pPr>
+              <w:spacing w:after="20"/>
+            </w:pPr>
+            <w:r/>
+            <w:r>
+              <w:rPr>
+                <w:sz w:val="18"/>
+              </w:rPr>
+              <w:t>1. Ответить верно</w:t>
+            </w:r>
+          </w:p>
+          <w:p>
+            <w:pPr>
+              <w:spacing w:after="20"/>
+            </w:pPr>
+            <w:r>
+              <w:rPr>
+                <w:sz w:val="18"/>
+              </w:rPr>
+              <w:t>2. На следующем шаге ответить неверно</w:t>
+            </w:r>
+          </w:p>
+          <w:p>
+            <w:pPr>
+              <w:spacing w:after="20"/>
+            </w:pPr>
+            <w:r>
+              <w:rPr>
+                <w:sz w:val="18"/>
+              </w:rPr>
+              <w:t>3. На свободном ответе попасть в часть критериев</w:t>
+            </w:r>
+          </w:p>
+          <w:p>
+            <w:pPr>
+              <w:spacing w:after="20"/>
+            </w:pPr>
+            <w:r>
+              <w:rPr>
+                <w:sz w:val="18"/>
+              </w:rPr>
+              <w:t>4. После ответа нажать динамик у примера, дождаться конца</w:t>
+            </w:r>
+          </w:p>
+          <w:p>
+            <w:pPr>
+              <w:spacing w:after="20"/>
+            </w:pPr>
+            <w:r>
+              <w:rPr>
+                <w:sz w:val="18"/>
+              </w:rPr>
+              <w:t>5. Свайпнуть назад и вперёд</w:t>
+            </w:r>
+          </w:p>
+        </w:tc>
+        <w:tc>
+          <w:tcPr>
+            <w:tcW w:type="dxa" w:w="2381"/>
+          </w:tcPr>
+          <w:p>
+            <w:pPr>
+              <w:spacing w:after="20"/>
+            </w:pPr>
+            <w:r/>
+            <w:r>
+              <w:rPr>
+                <w:sz w:val="18"/>
+              </w:rPr>
+              <w:t>Верно: слово «Верно», фон мятный, янтарное кольцо заливается и остаётся залитым. Неверно: «Не совсем», фон ошибки, ряд мягко оседает и выпрямляется; красного в самих точках нет. Частично: «Частично», янтарный фон. Каждая реакция играет один раз: после озвучки и после свайпа туда-обратно слово и фон те же, анимация не повторяется; лёгкая вибрация при каждой реакции один раз</w:t>
+            </w:r>
+          </w:p>
+        </w:tc>
+        <w:tc>
+          <w:tcPr>
+            <w:tcW w:type="dxa" w:w="794"/>
+          </w:tcPr>
+          <w:p>
+            <w:pPr>
+              <w:spacing w:after="20"/>
+            </w:pPr>
+            <w:r/>
+            <w:r>
+              <w:rPr>
+                <w:sz w:val="18"/>
+              </w:rPr>
+              <w:t>☐ PASS</w:t>
+              <w:br/>
+              <w:t>☐ FAIL</w:t>
+            </w:r>
+          </w:p>
+        </w:tc>
+      </w:tr>
+      <w:tr>
+        <w:tc>
+          <w:tcPr>
+            <w:tcW w:type="dxa" w:w="794"/>
+          </w:tcPr>
+          <w:p>
+            <w:pPr>
+              <w:spacing w:after="20"/>
+            </w:pPr>
+            <w:r/>
+            <w:r>
+              <w:rPr>
+                <w:sz w:val="18"/>
+              </w:rPr>
+              <w:t>D-14</w:t>
+            </w:r>
+          </w:p>
+        </w:tc>
+        <w:tc>
+          <w:tcPr>
+            <w:tcW w:type="dxa" w:w="1587"/>
+          </w:tcPr>
+          <w:p>
+            <w:pPr>
+              <w:spacing w:after="20"/>
+            </w:pPr>
+            <w:r/>
+            <w:r>
+              <w:rPr>
+                <w:sz w:val="18"/>
+              </w:rPr>
+              <w:t>Бадди: «Принято» без оценки</w:t>
+            </w:r>
+          </w:p>
+        </w:tc>
+        <w:tc>
+          <w:tcPr>
+            <w:tcW w:type="dxa" w:w="1587"/>
+          </w:tcPr>
+          <w:p>
+            <w:pPr>
+              <w:spacing w:after="20"/>
+            </w:pPr>
+            <w:r/>
+            <w:r>
+              <w:rPr>
+                <w:sz w:val="18"/>
+              </w:rPr>
+              <w:t>Первый урок своего предмета (диагностика)</w:t>
+            </w:r>
+          </w:p>
+        </w:tc>
+        <w:tc>
+          <w:tcPr>
+            <w:tcW w:type="dxa" w:w="3061"/>
+          </w:tcPr>
+          <w:p>
+            <w:pPr>
+              <w:spacing w:after="20"/>
+            </w:pPr>
+            <w:r/>
+            <w:r>
+              <w:rPr>
+                <w:sz w:val="18"/>
+              </w:rPr>
+              <w:t>1. На калибровке выбрать любой вариант</w:t>
+            </w:r>
+          </w:p>
+          <w:p>
+            <w:pPr>
+              <w:spacing w:after="20"/>
+            </w:pPr>
+            <w:r>
+              <w:rPr>
+                <w:sz w:val="18"/>
+              </w:rPr>
+              <w:t>2. На проверке «СТАРТ» ответить неверно</w:t>
+            </w:r>
+          </w:p>
+          <w:p>
+            <w:pPr>
+              <w:spacing w:after="20"/>
+            </w:pPr>
+            <w:r>
+              <w:rPr>
+                <w:sz w:val="18"/>
+              </w:rPr>
+              <w:t>3. На проверке «СТАРТ» (другой предмет) ответить верно</w:t>
+            </w:r>
+          </w:p>
+        </w:tc>
+        <w:tc>
+          <w:tcPr>
+            <w:tcW w:type="dxa" w:w="2381"/>
+          </w:tcPr>
+          <w:p>
+            <w:pPr>
+              <w:spacing w:after="20"/>
+            </w:pPr>
+            <w:r/>
+            <w:r>
+              <w:rPr>
+                <w:sz w:val="18"/>
+              </w:rPr>
+              <w:t>На калибровке и на неверном ответе «СТАРТ» слово «Принято», песочный фон, кольцо не заливается, ряд делает один мягкий «вдох»; нет «Не совсем» и красного фона. Верный ответ на «СТАРТ» — обычное «Верно»</w:t>
+            </w:r>
+          </w:p>
+        </w:tc>
+        <w:tc>
+          <w:tcPr>
+            <w:tcW w:type="dxa" w:w="794"/>
+          </w:tcPr>
+          <w:p>
+            <w:pPr>
+              <w:spacing w:after="20"/>
+            </w:pPr>
+            <w:r/>
+            <w:r>
+              <w:rPr>
+                <w:sz w:val="18"/>
+              </w:rPr>
+              <w:t>☐ PASS</w:t>
+              <w:br/>
+              <w:t>☐ FAIL</w:t>
+            </w:r>
+          </w:p>
+        </w:tc>
+      </w:tr>
+      <w:tr>
+        <w:tc>
+          <w:tcPr>
+            <w:tcW w:type="dxa" w:w="794"/>
+          </w:tcPr>
+          <w:p>
+            <w:pPr>
+              <w:spacing w:after="20"/>
+            </w:pPr>
+            <w:r/>
+            <w:r>
+              <w:rPr>
+                <w:sz w:val="18"/>
+              </w:rPr>
+              <w:t>D-15</w:t>
+            </w:r>
+          </w:p>
+        </w:tc>
+        <w:tc>
+          <w:tcPr>
+            <w:tcW w:type="dxa" w:w="1587"/>
+          </w:tcPr>
+          <w:p>
+            <w:pPr>
+              <w:spacing w:after="20"/>
+            </w:pPr>
+            <w:r/>
+            <w:r>
+              <w:rPr>
+                <w:sz w:val="18"/>
+              </w:rPr>
+              <w:t>Бадди: тёмная тема и «Уменьшение движения»</w:t>
+            </w:r>
+          </w:p>
+        </w:tc>
+        <w:tc>
+          <w:tcPr>
+            <w:tcW w:type="dxa" w:w="1587"/>
+          </w:tcPr>
+          <w:p>
+            <w:pPr>
+              <w:spacing w:after="20"/>
+            </w:pPr>
+            <w:r/>
+            <w:r>
+              <w:rPr>
+                <w:sz w:val="18"/>
+              </w:rPr>
+              <w:t>Любой урок</w:t>
+            </w:r>
+          </w:p>
+        </w:tc>
+        <w:tc>
+          <w:tcPr>
+            <w:tcW w:type="dxa" w:w="3061"/>
+          </w:tcPr>
+          <w:p>
+            <w:pPr>
+              <w:spacing w:after="20"/>
+            </w:pPr>
+            <w:r/>
+            <w:r>
+              <w:rPr>
+                <w:sz w:val="18"/>
+              </w:rPr>
+              <w:t>1. Профиль → тема «Тёмная», открыть урок</w:t>
+            </w:r>
+          </w:p>
+          <w:p>
+            <w:pPr>
+              <w:spacing w:after="20"/>
+            </w:pPr>
+            <w:r>
+              <w:rPr>
+                <w:sz w:val="18"/>
+              </w:rPr>
+              <w:t>2. Настройки iOS → Универсальный доступ → Движение → включить «Уменьшение движения», открыть урок</w:t>
+            </w:r>
+          </w:p>
+        </w:tc>
+        <w:tc>
+          <w:tcPr>
+            <w:tcW w:type="dxa" w:w="2381"/>
+          </w:tcPr>
+          <w:p>
+            <w:pPr>
+              <w:spacing w:after="20"/>
+            </w:pPr>
+            <w:r/>
+            <w:r>
+              <w:rPr>
+                <w:sz w:val="18"/>
+              </w:rPr>
+              <w:t>В тёмной теме точки светло-мятные, кольцо янтарное, фон реакций читается. При уменьшении движения точки не двигаются, меняются только слово, фон и заливка кольца на «Верно»</w:t>
             </w:r>
           </w:p>
         </w:tc>
@@ -12566,6 +13367,33 @@
     </w:p>
     <w:p>
       <w:pPr>
+        <w:pStyle w:val="ListBullet"/>
+        <w:spacing w:after="40"/>
+      </w:pPr>
+      <w:r>
+        <w:t>Точки бадди в состоянии «Слушаю» не отражают громкость голоса: это условный эквалайзер, уровень микрофона приложению недоступен.</w:t>
+      </w:r>
+    </w:p>
+    <w:p>
+      <w:pPr>
+        <w:pStyle w:val="ListBullet"/>
+        <w:spacing w:after="40"/>
+      </w:pPr>
+      <w:r>
+        <w:t>«Принято» вместо «Верно»/«Не совсем» на калибровке и на неверном ответе «СТАРТ»: такие шаги не оцениваются.</w:t>
+      </w:r>
+    </w:p>
+    <w:p>
+      <w:pPr>
+        <w:pStyle w:val="ListBullet"/>
+        <w:spacing w:after="40"/>
+      </w:pPr>
+      <w:r>
+        <w:t>Подсказка «Есть сборка N» не появляется, если установлена последняя сборка или сервер недоступен.</w:t>
+      </w:r>
+    </w:p>
+    <w:p>
+      <w:pPr>
         <w:pStyle w:val="Heading1"/>
       </w:pPr>
       <w:r>
@@ -12901,6 +13729,42 @@
                 <w:sz w:val="19"/>
               </w:rPr>
               <w:t>Сжатая суть уроков предмета, 3–6 терминов после каждого урока, доступен офлайн</w:t>
+            </w:r>
+          </w:p>
+        </w:tc>
+      </w:tr>
+      <w:tr>
+        <w:tc>
+          <w:tcPr>
+            <w:tcW w:type="dxa" w:w="2268"/>
+          </w:tcPr>
+          <w:p>
+            <w:pPr>
+              <w:spacing w:after="20"/>
+            </w:pPr>
+            <w:r/>
+            <w:r>
+              <w:rPr>
+                <w:sz w:val="19"/>
+              </w:rPr>
+              <w:t>Бадди</w:t>
+            </w:r>
+          </w:p>
+        </w:tc>
+        <w:tc>
+          <w:tcPr>
+            <w:tcW w:type="dxa" w:w="7370"/>
+          </w:tcPr>
+          <w:p>
+            <w:pPr>
+              <w:spacing w:after="20"/>
+            </w:pPr>
+            <w:r/>
+            <w:r>
+              <w:rPr>
+                <w:sz w:val="19"/>
+              </w:rPr>
+              <w:t>Карточка над главной кнопкой урока: четыре точки знака Teach и слово состояния («Ваш ход», «Слушаю», «Думаю», «Верно», «Принято»…); показывает, чья очередь, и реагирует на ответ</w:t>
             </w:r>
           </w:p>
         </w:tc>

</xml_diff>

<commit_message>
QA docs: section 5.13 with 14 test cases for the buddy conversation (future build), doc v1.2, 95 cases
Co-Authored-By: Claude Fable 5.1 <noreply@anthropic.com>
</commit_message>
<xml_diff>
--- a/docs/qa/Teach — тестовая документация QA.docx
+++ b/docs/qa/Teach — тестовая документация QA.docx
@@ -111,7 +111,7 @@
               <w:rPr>
                 <w:sz w:val="19"/>
               </w:rPr>
-              <w:t>1.1 · 11 сентября 2026</w:t>
+              <w:t>1.2 · 14 сентября 2026</w:t>
             </w:r>
           </w:p>
         </w:tc>
@@ -12850,6 +12850,1772 @@
     </w:p>
     <w:p>
       <w:pPr>
+        <w:pStyle w:val="Heading2"/>
+      </w:pPr>
+      <w:r>
+        <w:t>5.13 Разговор с бадди (FR-66, будущая сборка)</w:t>
+      </w:r>
+    </w:p>
+    <w:p>
+      <w:pPr>
+        <w:spacing w:after="120"/>
+      </w:pPr>
+      <w:r>
+        <w:rPr>
+          <w:b w:val="0"/>
+          <w:i w:val="0"/>
+        </w:rPr>
+        <w:t>Раздел для сборки, в которой появится голосовой разговор с бадди (FRD: FR-66…68, SR-16). Пока функции нет в build, раздел пропускается; в bug report указывайте номер build, где она появилась. Разговор идёт так: платформенное распознавание → текст на сервер → ответ бадди озвучивается системным голосом. Бадди обращается на «ты» — это характер персонажа, не bug.</w:t>
+      </w:r>
+    </w:p>
+    <w:tbl>
+      <w:tblPr>
+        <w:tblStyle w:val="TableGrid"/>
+        <w:tblW w:type="auto" w:w="0"/>
+        <w:jc w:val="center"/>
+        <w:tblLook w:firstColumn="1" w:firstRow="1" w:lastColumn="0" w:lastRow="0" w:noHBand="0" w:noVBand="1" w:val="04A0"/>
+      </w:tblPr>
+      <w:tblGrid>
+        <w:gridCol w:w="1662"/>
+        <w:gridCol w:w="1662"/>
+        <w:gridCol w:w="1662"/>
+        <w:gridCol w:w="1662"/>
+        <w:gridCol w:w="1662"/>
+        <w:gridCol w:w="1662"/>
+      </w:tblGrid>
+      <w:tr>
+        <w:tc>
+          <w:tcPr>
+            <w:tcW w:type="dxa" w:w="794"/>
+            <w:shd w:val="clear" w:color="auto" w:fill="DCEEDF"/>
+          </w:tcPr>
+          <w:p>
+            <w:r/>
+            <w:r>
+              <w:rPr>
+                <w:b/>
+                <w:sz w:val="18"/>
+              </w:rPr>
+              <w:t>ID</w:t>
+            </w:r>
+          </w:p>
+        </w:tc>
+        <w:tc>
+          <w:tcPr>
+            <w:tcW w:type="dxa" w:w="1587"/>
+            <w:shd w:val="clear" w:color="auto" w:fill="DCEEDF"/>
+          </w:tcPr>
+          <w:p>
+            <w:r/>
+            <w:r>
+              <w:rPr>
+                <w:b/>
+                <w:sz w:val="18"/>
+              </w:rPr>
+              <w:t>Test case</w:t>
+            </w:r>
+          </w:p>
+        </w:tc>
+        <w:tc>
+          <w:tcPr>
+            <w:tcW w:type="dxa" w:w="1587"/>
+            <w:shd w:val="clear" w:color="auto" w:fill="DCEEDF"/>
+          </w:tcPr>
+          <w:p>
+            <w:r/>
+            <w:r>
+              <w:rPr>
+                <w:b/>
+                <w:sz w:val="18"/>
+              </w:rPr>
+              <w:t>Preconditions</w:t>
+            </w:r>
+          </w:p>
+        </w:tc>
+        <w:tc>
+          <w:tcPr>
+            <w:tcW w:type="dxa" w:w="3061"/>
+            <w:shd w:val="clear" w:color="auto" w:fill="DCEEDF"/>
+          </w:tcPr>
+          <w:p>
+            <w:r/>
+            <w:r>
+              <w:rPr>
+                <w:b/>
+                <w:sz w:val="18"/>
+              </w:rPr>
+              <w:t>Steps</w:t>
+            </w:r>
+          </w:p>
+        </w:tc>
+        <w:tc>
+          <w:tcPr>
+            <w:tcW w:type="dxa" w:w="2381"/>
+            <w:shd w:val="clear" w:color="auto" w:fill="DCEEDF"/>
+          </w:tcPr>
+          <w:p>
+            <w:r/>
+            <w:r>
+              <w:rPr>
+                <w:b/>
+                <w:sz w:val="18"/>
+              </w:rPr>
+              <w:t>Expected result</w:t>
+            </w:r>
+          </w:p>
+        </w:tc>
+        <w:tc>
+          <w:tcPr>
+            <w:tcW w:type="dxa" w:w="794"/>
+            <w:shd w:val="clear" w:color="auto" w:fill="DCEEDF"/>
+          </w:tcPr>
+          <w:p>
+            <w:r/>
+            <w:r>
+              <w:rPr>
+                <w:b/>
+                <w:sz w:val="18"/>
+              </w:rPr>
+              <w:t>Result</w:t>
+            </w:r>
+          </w:p>
+        </w:tc>
+      </w:tr>
+      <w:tr>
+        <w:tc>
+          <w:tcPr>
+            <w:tcW w:type="dxa" w:w="794"/>
+          </w:tcPr>
+          <w:p>
+            <w:pPr>
+              <w:spacing w:after="20"/>
+            </w:pPr>
+            <w:r/>
+            <w:r>
+              <w:rPr>
+                <w:sz w:val="18"/>
+              </w:rPr>
+              <w:t>M-01</w:t>
+            </w:r>
+          </w:p>
+        </w:tc>
+        <w:tc>
+          <w:tcPr>
+            <w:tcW w:type="dxa" w:w="1587"/>
+          </w:tcPr>
+          <w:p>
+            <w:pPr>
+              <w:spacing w:after="20"/>
+            </w:pPr>
+            <w:r/>
+            <w:r>
+              <w:rPr>
+                <w:sz w:val="18"/>
+              </w:rPr>
+              <w:t>Вход с «Сегодня»</w:t>
+            </w:r>
+          </w:p>
+        </w:tc>
+        <w:tc>
+          <w:tcPr>
+            <w:tcW w:type="dxa" w:w="1587"/>
+          </w:tcPr>
+          <w:p>
+            <w:pPr>
+              <w:spacing w:after="20"/>
+            </w:pPr>
+            <w:r/>
+            <w:r>
+              <w:rPr>
+                <w:sz w:val="18"/>
+              </w:rPr>
+              <w:t>Свой предмет с готовым уроком</w:t>
+            </w:r>
+          </w:p>
+        </w:tc>
+        <w:tc>
+          <w:tcPr>
+            <w:tcW w:type="dxa" w:w="3061"/>
+          </w:tcPr>
+          <w:p>
+            <w:pPr>
+              <w:spacing w:after="20"/>
+            </w:pPr>
+            <w:r/>
+            <w:r>
+              <w:rPr>
+                <w:sz w:val="18"/>
+              </w:rPr>
+              <w:t>1. Открыть «Сегодня», посмотреть карточку предмета</w:t>
+            </w:r>
+          </w:p>
+          <w:p>
+            <w:pPr>
+              <w:spacing w:after="20"/>
+            </w:pPr>
+            <w:r>
+              <w:rPr>
+                <w:sz w:val="18"/>
+              </w:rPr>
+              <w:t>2. Нажать строку «Поговорить с бадди»</w:t>
+            </w:r>
+          </w:p>
+        </w:tc>
+        <w:tc>
+          <w:tcPr>
+            <w:tcW w:type="dxa" w:w="2381"/>
+          </w:tcPr>
+          <w:p>
+            <w:pPr>
+              <w:spacing w:after="20"/>
+            </w:pPr>
+            <w:r/>
+            <w:r>
+              <w:rPr>
+                <w:sz w:val="18"/>
+              </w:rPr>
+              <w:t>Под чипом статуса и «Начать» есть строка со знаком бадди, «Поговорить с бадди» и «3–5 минут по теме этапа, голосом»; нажатие открывает экран разговора. У предмета «Готовится…» строки нет</w:t>
+            </w:r>
+          </w:p>
+        </w:tc>
+        <w:tc>
+          <w:tcPr>
+            <w:tcW w:type="dxa" w:w="794"/>
+          </w:tcPr>
+          <w:p>
+            <w:pPr>
+              <w:spacing w:after="20"/>
+            </w:pPr>
+            <w:r/>
+            <w:r>
+              <w:rPr>
+                <w:sz w:val="18"/>
+              </w:rPr>
+              <w:t>☐ PASS</w:t>
+              <w:br/>
+              <w:t>☐ FAIL</w:t>
+            </w:r>
+          </w:p>
+        </w:tc>
+      </w:tr>
+      <w:tr>
+        <w:tc>
+          <w:tcPr>
+            <w:tcW w:type="dxa" w:w="794"/>
+          </w:tcPr>
+          <w:p>
+            <w:pPr>
+              <w:spacing w:after="20"/>
+            </w:pPr>
+            <w:r/>
+            <w:r>
+              <w:rPr>
+                <w:sz w:val="18"/>
+              </w:rPr>
+              <w:t>M-02</w:t>
+            </w:r>
+          </w:p>
+        </w:tc>
+        <w:tc>
+          <w:tcPr>
+            <w:tcW w:type="dxa" w:w="1587"/>
+          </w:tcPr>
+          <w:p>
+            <w:pPr>
+              <w:spacing w:after="20"/>
+            </w:pPr>
+            <w:r/>
+            <w:r>
+              <w:rPr>
+                <w:sz w:val="18"/>
+              </w:rPr>
+              <w:t>Экран разговора и первая реплика</w:t>
+            </w:r>
+          </w:p>
+        </w:tc>
+        <w:tc>
+          <w:tcPr>
+            <w:tcW w:type="dxa" w:w="1587"/>
+          </w:tcPr>
+          <w:p>
+            <w:pPr>
+              <w:spacing w:after="20"/>
+            </w:pPr>
+            <w:r/>
+            <w:r>
+              <w:rPr>
+                <w:sz w:val="18"/>
+              </w:rPr>
+              <w:t>Открыт разговор</w:t>
+            </w:r>
+          </w:p>
+        </w:tc>
+        <w:tc>
+          <w:tcPr>
+            <w:tcW w:type="dxa" w:w="3061"/>
+          </w:tcPr>
+          <w:p>
+            <w:pPr>
+              <w:spacing w:after="20"/>
+            </w:pPr>
+            <w:r/>
+            <w:r>
+              <w:rPr>
+                <w:sz w:val="18"/>
+              </w:rPr>
+              <w:t>1. Прочитать шапку и строку под ней</w:t>
+            </w:r>
+          </w:p>
+          <w:p>
+            <w:pPr>
+              <w:spacing w:after="20"/>
+            </w:pPr>
+            <w:r>
+              <w:rPr>
+                <w:sz w:val="18"/>
+              </w:rPr>
+              <w:t>2. Дождаться первой реплики бадди</w:t>
+            </w:r>
+          </w:p>
+        </w:tc>
+        <w:tc>
+          <w:tcPr>
+            <w:tcW w:type="dxa" w:w="2381"/>
+          </w:tcPr>
+          <w:p>
+            <w:pPr>
+              <w:spacing w:after="20"/>
+            </w:pPr>
+            <w:r/>
+            <w:r>
+              <w:rPr>
+                <w:sz w:val="18"/>
+              </w:rPr>
+              <w:t>В шапке крестик, чип с именем предмета, справа таймер mm:ss, он идёт; под шапкой «Разговор · этап N» и тема этапа. Бадди начинает сам: короткая реплика по теме этапа появляется и озвучивается, в доке «Говорю» и волна по точкам; по окончании «Ваш ход», микрофон зелёный, подсказка «Нажмите и говорите»</w:t>
+            </w:r>
+          </w:p>
+        </w:tc>
+        <w:tc>
+          <w:tcPr>
+            <w:tcW w:type="dxa" w:w="794"/>
+          </w:tcPr>
+          <w:p>
+            <w:pPr>
+              <w:spacing w:after="20"/>
+            </w:pPr>
+            <w:r/>
+            <w:r>
+              <w:rPr>
+                <w:sz w:val="18"/>
+              </w:rPr>
+              <w:t>☐ PASS</w:t>
+              <w:br/>
+              <w:t>☐ FAIL</w:t>
+            </w:r>
+          </w:p>
+        </w:tc>
+      </w:tr>
+      <w:tr>
+        <w:tc>
+          <w:tcPr>
+            <w:tcW w:type="dxa" w:w="794"/>
+          </w:tcPr>
+          <w:p>
+            <w:pPr>
+              <w:spacing w:after="20"/>
+            </w:pPr>
+            <w:r/>
+            <w:r>
+              <w:rPr>
+                <w:sz w:val="18"/>
+              </w:rPr>
+              <w:t>M-03</w:t>
+            </w:r>
+          </w:p>
+        </w:tc>
+        <w:tc>
+          <w:tcPr>
+            <w:tcW w:type="dxa" w:w="1587"/>
+          </w:tcPr>
+          <w:p>
+            <w:pPr>
+              <w:spacing w:after="20"/>
+            </w:pPr>
+            <w:r/>
+            <w:r>
+              <w:rPr>
+                <w:sz w:val="18"/>
+              </w:rPr>
+              <w:t>Реплика голосом</w:t>
+            </w:r>
+          </w:p>
+        </w:tc>
+        <w:tc>
+          <w:tcPr>
+            <w:tcW w:type="dxa" w:w="1587"/>
+          </w:tcPr>
+          <w:p>
+            <w:pPr>
+              <w:spacing w:after="20"/>
+            </w:pPr>
+            <w:r/>
+            <w:r>
+              <w:rPr>
+                <w:sz w:val="18"/>
+              </w:rPr>
+              <w:t>Первая реплика бадди прозвучала</w:t>
+            </w:r>
+          </w:p>
+        </w:tc>
+        <w:tc>
+          <w:tcPr>
+            <w:tcW w:type="dxa" w:w="3061"/>
+          </w:tcPr>
+          <w:p>
+            <w:pPr>
+              <w:spacing w:after="20"/>
+            </w:pPr>
+            <w:r/>
+            <w:r>
+              <w:rPr>
+                <w:sz w:val="18"/>
+              </w:rPr>
+              <w:t>1. Нажать микрофон, сказать ответ на 5–10 слов</w:t>
+            </w:r>
+          </w:p>
+          <w:p>
+            <w:pPr>
+              <w:spacing w:after="20"/>
+            </w:pPr>
+            <w:r>
+              <w:rPr>
+                <w:sz w:val="18"/>
+              </w:rPr>
+              <w:t>2. Нажать микрофон ещё раз</w:t>
+            </w:r>
+          </w:p>
+        </w:tc>
+        <w:tc>
+          <w:tcPr>
+            <w:tcW w:type="dxa" w:w="2381"/>
+          </w:tcPr>
+          <w:p>
+            <w:pPr>
+              <w:spacing w:after="20"/>
+            </w:pPr>
+            <w:r/>
+            <w:r>
+              <w:rPr>
+                <w:sz w:val="18"/>
+              </w:rPr>
+              <w:t>Во время записи кнопка красная с ореолом и квадратом, в доке «Слушаю» и эквалайзер, транскрипт растёт серым в рамке справа. После нажатия текст становится тёмным, док «Думаю», точки сходятся; затем ответ бадди появляется по мере озвучки с «Говорю». Ответ 1–3 предложения, по теме, отвечает на сказанное; потом «Ваш ход»</w:t>
+            </w:r>
+          </w:p>
+        </w:tc>
+        <w:tc>
+          <w:tcPr>
+            <w:tcW w:type="dxa" w:w="794"/>
+          </w:tcPr>
+          <w:p>
+            <w:pPr>
+              <w:spacing w:after="20"/>
+            </w:pPr>
+            <w:r/>
+            <w:r>
+              <w:rPr>
+                <w:sz w:val="18"/>
+              </w:rPr>
+              <w:t>☐ PASS</w:t>
+              <w:br/>
+              <w:t>☐ FAIL</w:t>
+            </w:r>
+          </w:p>
+        </w:tc>
+      </w:tr>
+      <w:tr>
+        <w:tc>
+          <w:tcPr>
+            <w:tcW w:type="dxa" w:w="794"/>
+          </w:tcPr>
+          <w:p>
+            <w:pPr>
+              <w:spacing w:after="20"/>
+            </w:pPr>
+            <w:r/>
+            <w:r>
+              <w:rPr>
+                <w:sz w:val="18"/>
+              </w:rPr>
+              <w:t>M-04</w:t>
+            </w:r>
+          </w:p>
+        </w:tc>
+        <w:tc>
+          <w:tcPr>
+            <w:tcW w:type="dxa" w:w="1587"/>
+          </w:tcPr>
+          <w:p>
+            <w:pPr>
+              <w:spacing w:after="20"/>
+            </w:pPr>
+            <w:r/>
+            <w:r>
+              <w:rPr>
+                <w:sz w:val="18"/>
+              </w:rPr>
+              <w:t>Перебивание</w:t>
+            </w:r>
+          </w:p>
+        </w:tc>
+        <w:tc>
+          <w:tcPr>
+            <w:tcW w:type="dxa" w:w="1587"/>
+          </w:tcPr>
+          <w:p>
+            <w:pPr>
+              <w:spacing w:after="20"/>
+            </w:pPr>
+            <w:r/>
+            <w:r>
+              <w:rPr>
+                <w:sz w:val="18"/>
+              </w:rPr>
+              <w:t>Бадди говорит длинную реплику</w:t>
+            </w:r>
+          </w:p>
+        </w:tc>
+        <w:tc>
+          <w:tcPr>
+            <w:tcW w:type="dxa" w:w="3061"/>
+          </w:tcPr>
+          <w:p>
+            <w:pPr>
+              <w:spacing w:after="20"/>
+            </w:pPr>
+            <w:r/>
+            <w:r>
+              <w:rPr>
+                <w:sz w:val="18"/>
+              </w:rPr>
+              <w:t>1. Во время «Говорю» нажать микрофон</w:t>
+            </w:r>
+          </w:p>
+        </w:tc>
+        <w:tc>
+          <w:tcPr>
+            <w:tcW w:type="dxa" w:w="2381"/>
+          </w:tcPr>
+          <w:p>
+            <w:pPr>
+              <w:spacing w:after="20"/>
+            </w:pPr>
+            <w:r/>
+            <w:r>
+              <w:rPr>
+                <w:sz w:val="18"/>
+              </w:rPr>
+              <w:t>Озвучка останавливается сразу, текст реплики остаётся обрезанным на месте остановки, док переходит в «Слушаю», запись идёт; бадди не договаривает старую реплику после вашей новой</w:t>
+            </w:r>
+          </w:p>
+        </w:tc>
+        <w:tc>
+          <w:tcPr>
+            <w:tcW w:type="dxa" w:w="794"/>
+          </w:tcPr>
+          <w:p>
+            <w:pPr>
+              <w:spacing w:after="20"/>
+            </w:pPr>
+            <w:r/>
+            <w:r>
+              <w:rPr>
+                <w:sz w:val="18"/>
+              </w:rPr>
+              <w:t>☐ PASS</w:t>
+              <w:br/>
+              <w:t>☐ FAIL</w:t>
+            </w:r>
+          </w:p>
+        </w:tc>
+      </w:tr>
+      <w:tr>
+        <w:tc>
+          <w:tcPr>
+            <w:tcW w:type="dxa" w:w="794"/>
+          </w:tcPr>
+          <w:p>
+            <w:pPr>
+              <w:spacing w:after="20"/>
+            </w:pPr>
+            <w:r/>
+            <w:r>
+              <w:rPr>
+                <w:sz w:val="18"/>
+              </w:rPr>
+              <w:t>M-05</w:t>
+            </w:r>
+          </w:p>
+        </w:tc>
+        <w:tc>
+          <w:tcPr>
+            <w:tcW w:type="dxa" w:w="1587"/>
+          </w:tcPr>
+          <w:p>
+            <w:pPr>
+              <w:spacing w:after="20"/>
+            </w:pPr>
+            <w:r/>
+            <w:r>
+              <w:rPr>
+                <w:sz w:val="18"/>
+              </w:rPr>
+              <w:t>Бадди знает предмет и ваши ошибки</w:t>
+            </w:r>
+          </w:p>
+        </w:tc>
+        <w:tc>
+          <w:tcPr>
+            <w:tcW w:type="dxa" w:w="1587"/>
+          </w:tcPr>
+          <w:p>
+            <w:pPr>
+              <w:spacing w:after="20"/>
+            </w:pPr>
+            <w:r/>
+            <w:r>
+              <w:rPr>
+                <w:sz w:val="18"/>
+              </w:rPr>
+              <w:t>Пройдено 2–3 урока предмета, в разборах были ошибки</w:t>
+            </w:r>
+          </w:p>
+        </w:tc>
+        <w:tc>
+          <w:tcPr>
+            <w:tcW w:type="dxa" w:w="3061"/>
+          </w:tcPr>
+          <w:p>
+            <w:pPr>
+              <w:spacing w:after="20"/>
+            </w:pPr>
+            <w:r/>
+            <w:r>
+              <w:rPr>
+                <w:sz w:val="18"/>
+              </w:rPr>
+              <w:t>1. Спросить: «Что мне стоит повторить?»</w:t>
+            </w:r>
+          </w:p>
+          <w:p>
+            <w:pPr>
+              <w:spacing w:after="20"/>
+            </w:pPr>
+            <w:r>
+              <w:rPr>
+                <w:sz w:val="18"/>
+              </w:rPr>
+              <w:t>2. Сказать что-то не по теме предмета</w:t>
+            </w:r>
+          </w:p>
+        </w:tc>
+        <w:tc>
+          <w:tcPr>
+            <w:tcW w:type="dxa" w:w="2381"/>
+          </w:tcPr>
+          <w:p>
+            <w:pPr>
+              <w:spacing w:after="20"/>
+            </w:pPr>
+            <w:r/>
+            <w:r>
+              <w:rPr>
+                <w:sz w:val="18"/>
+              </w:rPr>
+              <w:t>Бадди называет тему этапа и конкретную ошибку из прошлых уроков, а не общие слова. На постороннюю тему коротко возвращает к предмету, не читает лекцию</w:t>
+            </w:r>
+          </w:p>
+        </w:tc>
+        <w:tc>
+          <w:tcPr>
+            <w:tcW w:type="dxa" w:w="794"/>
+          </w:tcPr>
+          <w:p>
+            <w:pPr>
+              <w:spacing w:after="20"/>
+            </w:pPr>
+            <w:r/>
+            <w:r>
+              <w:rPr>
+                <w:sz w:val="18"/>
+              </w:rPr>
+              <w:t>☐ PASS</w:t>
+              <w:br/>
+              <w:t>☐ FAIL</w:t>
+            </w:r>
+          </w:p>
+        </w:tc>
+      </w:tr>
+      <w:tr>
+        <w:tc>
+          <w:tcPr>
+            <w:tcW w:type="dxa" w:w="794"/>
+          </w:tcPr>
+          <w:p>
+            <w:pPr>
+              <w:spacing w:after="20"/>
+            </w:pPr>
+            <w:r/>
+            <w:r>
+              <w:rPr>
+                <w:sz w:val="18"/>
+              </w:rPr>
+              <w:t>M-06</w:t>
+            </w:r>
+          </w:p>
+        </w:tc>
+        <w:tc>
+          <w:tcPr>
+            <w:tcW w:type="dxa" w:w="1587"/>
+          </w:tcPr>
+          <w:p>
+            <w:pPr>
+              <w:spacing w:after="20"/>
+            </w:pPr>
+            <w:r/>
+            <w:r>
+              <w:rPr>
+                <w:sz w:val="18"/>
+              </w:rPr>
+              <w:t>Задержка ответа</w:t>
+            </w:r>
+          </w:p>
+        </w:tc>
+        <w:tc>
+          <w:tcPr>
+            <w:tcW w:type="dxa" w:w="1587"/>
+          </w:tcPr>
+          <w:p>
+            <w:pPr>
+              <w:spacing w:after="20"/>
+            </w:pPr>
+            <w:r/>
+            <w:r>
+              <w:rPr>
+                <w:sz w:val="18"/>
+              </w:rPr>
+              <w:t>Стабильный Wi-Fi, screen recording включён</w:t>
+            </w:r>
+          </w:p>
+        </w:tc>
+        <w:tc>
+          <w:tcPr>
+            <w:tcW w:type="dxa" w:w="3061"/>
+          </w:tcPr>
+          <w:p>
+            <w:pPr>
+              <w:spacing w:after="20"/>
+            </w:pPr>
+            <w:r/>
+            <w:r>
+              <w:rPr>
+                <w:sz w:val="18"/>
+              </w:rPr>
+              <w:t>1. Сказать короткую фразу, остановить запись</w:t>
+            </w:r>
+          </w:p>
+          <w:p>
+            <w:pPr>
+              <w:spacing w:after="20"/>
+            </w:pPr>
+            <w:r>
+              <w:rPr>
+                <w:sz w:val="18"/>
+              </w:rPr>
+              <w:t>2. По записи экрана замерить время от остановки до начала речи бадди</w:t>
+            </w:r>
+          </w:p>
+          <w:p>
+            <w:pPr>
+              <w:spacing w:after="20"/>
+            </w:pPr>
+            <w:r>
+              <w:rPr>
+                <w:sz w:val="18"/>
+              </w:rPr>
+              <w:t>3. Повторить 3 раза</w:t>
+            </w:r>
+          </w:p>
+        </w:tc>
+        <w:tc>
+          <w:tcPr>
+            <w:tcW w:type="dxa" w:w="2381"/>
+          </w:tcPr>
+          <w:p>
+            <w:pPr>
+              <w:spacing w:after="20"/>
+            </w:pPr>
+            <w:r/>
+            <w:r>
+              <w:rPr>
+                <w:sz w:val="18"/>
+              </w:rPr>
+              <w:t>Первая фраза бадди звучит через 1–2 с после остановки записи; «Думаю» не висит дольше 4 с; при превышении приложите запись экрана</w:t>
+            </w:r>
+          </w:p>
+        </w:tc>
+        <w:tc>
+          <w:tcPr>
+            <w:tcW w:type="dxa" w:w="794"/>
+          </w:tcPr>
+          <w:p>
+            <w:pPr>
+              <w:spacing w:after="20"/>
+            </w:pPr>
+            <w:r/>
+            <w:r>
+              <w:rPr>
+                <w:sz w:val="18"/>
+              </w:rPr>
+              <w:t>☐ PASS</w:t>
+              <w:br/>
+              <w:t>☐ FAIL</w:t>
+            </w:r>
+          </w:p>
+        </w:tc>
+      </w:tr>
+      <w:tr>
+        <w:tc>
+          <w:tcPr>
+            <w:tcW w:type="dxa" w:w="794"/>
+          </w:tcPr>
+          <w:p>
+            <w:pPr>
+              <w:spacing w:after="20"/>
+            </w:pPr>
+            <w:r/>
+            <w:r>
+              <w:rPr>
+                <w:sz w:val="18"/>
+              </w:rPr>
+              <w:t>M-07</w:t>
+            </w:r>
+          </w:p>
+        </w:tc>
+        <w:tc>
+          <w:tcPr>
+            <w:tcW w:type="dxa" w:w="1587"/>
+          </w:tcPr>
+          <w:p>
+            <w:pPr>
+              <w:spacing w:after="20"/>
+            </w:pPr>
+            <w:r/>
+            <w:r>
+              <w:rPr>
+                <w:sz w:val="18"/>
+              </w:rPr>
+              <w:t>Длинный разговор</w:t>
+            </w:r>
+          </w:p>
+        </w:tc>
+        <w:tc>
+          <w:tcPr>
+            <w:tcW w:type="dxa" w:w="1587"/>
+          </w:tcPr>
+          <w:p>
+            <w:pPr>
+              <w:spacing w:after="20"/>
+            </w:pPr>
+            <w:r/>
+            <w:r>
+              <w:rPr>
+                <w:sz w:val="18"/>
+              </w:rPr>
+              <w:t>Открыт разговор</w:t>
+            </w:r>
+          </w:p>
+        </w:tc>
+        <w:tc>
+          <w:tcPr>
+            <w:tcW w:type="dxa" w:w="3061"/>
+          </w:tcPr>
+          <w:p>
+            <w:pPr>
+              <w:spacing w:after="20"/>
+            </w:pPr>
+            <w:r/>
+            <w:r>
+              <w:rPr>
+                <w:sz w:val="18"/>
+              </w:rPr>
+              <w:t>1. Обменяться 15–20 репликами</w:t>
+            </w:r>
+          </w:p>
+        </w:tc>
+        <w:tc>
+          <w:tcPr>
+            <w:tcW w:type="dxa" w:w="2381"/>
+          </w:tcPr>
+          <w:p>
+            <w:pPr>
+              <w:spacing w:after="20"/>
+            </w:pPr>
+            <w:r/>
+            <w:r>
+              <w:rPr>
+                <w:sz w:val="18"/>
+              </w:rPr>
+              <w:t>Ответы не замедляются к концу; лента показывает последние реплики, старые уходят вверх с плавным затуханием; таймер идёт; приложение не греется заметно и не падает</w:t>
+            </w:r>
+          </w:p>
+        </w:tc>
+        <w:tc>
+          <w:tcPr>
+            <w:tcW w:type="dxa" w:w="794"/>
+          </w:tcPr>
+          <w:p>
+            <w:pPr>
+              <w:spacing w:after="20"/>
+            </w:pPr>
+            <w:r/>
+            <w:r>
+              <w:rPr>
+                <w:sz w:val="18"/>
+              </w:rPr>
+              <w:t>☐ PASS</w:t>
+              <w:br/>
+              <w:t>☐ FAIL</w:t>
+            </w:r>
+          </w:p>
+        </w:tc>
+      </w:tr>
+      <w:tr>
+        <w:tc>
+          <w:tcPr>
+            <w:tcW w:type="dxa" w:w="794"/>
+          </w:tcPr>
+          <w:p>
+            <w:pPr>
+              <w:spacing w:after="20"/>
+            </w:pPr>
+            <w:r/>
+            <w:r>
+              <w:rPr>
+                <w:sz w:val="18"/>
+              </w:rPr>
+              <w:t>M-08</w:t>
+            </w:r>
+          </w:p>
+        </w:tc>
+        <w:tc>
+          <w:tcPr>
+            <w:tcW w:type="dxa" w:w="1587"/>
+          </w:tcPr>
+          <w:p>
+            <w:pPr>
+              <w:spacing w:after="20"/>
+            </w:pPr>
+            <w:r/>
+            <w:r>
+              <w:rPr>
+                <w:sz w:val="18"/>
+              </w:rPr>
+              <w:t>Язык распознавания и озвучки</w:t>
+            </w:r>
+          </w:p>
+        </w:tc>
+        <w:tc>
+          <w:tcPr>
+            <w:tcW w:type="dxa" w:w="1587"/>
+          </w:tcPr>
+          <w:p>
+            <w:pPr>
+              <w:spacing w:after="20"/>
+            </w:pPr>
+            <w:r/>
+            <w:r>
+              <w:rPr>
+                <w:sz w:val="18"/>
+              </w:rPr>
+              <w:t>Языковой предмет («Итальянский» или «Испанский»)</w:t>
+            </w:r>
+          </w:p>
+        </w:tc>
+        <w:tc>
+          <w:tcPr>
+            <w:tcW w:type="dxa" w:w="3061"/>
+          </w:tcPr>
+          <w:p>
+            <w:pPr>
+              <w:spacing w:after="20"/>
+            </w:pPr>
+            <w:r/>
+            <w:r>
+              <w:rPr>
+                <w:sz w:val="18"/>
+              </w:rPr>
+              <w:t>1. Ответить на языке предмета</w:t>
+            </w:r>
+          </w:p>
+          <w:p>
+            <w:pPr>
+              <w:spacing w:after="20"/>
+            </w:pPr>
+            <w:r>
+              <w:rPr>
+                <w:sz w:val="18"/>
+              </w:rPr>
+              <w:t>2. В настройках предмета переключить язык распознавания на язык интерфейса и ответить по-русски</w:t>
+            </w:r>
+          </w:p>
+        </w:tc>
+        <w:tc>
+          <w:tcPr>
+            <w:tcW w:type="dxa" w:w="2381"/>
+          </w:tcPr>
+          <w:p>
+            <w:pPr>
+              <w:spacing w:after="20"/>
+            </w:pPr>
+            <w:r/>
+            <w:r>
+              <w:rPr>
+                <w:sz w:val="18"/>
+              </w:rPr>
+              <w:t>Речь на языке предмета распознаётся верно; после переключения русская речь распознаётся, а фразы на языке предмета в ответе бадди озвучиваются голосом этого языка, русские — русским</w:t>
+            </w:r>
+          </w:p>
+        </w:tc>
+        <w:tc>
+          <w:tcPr>
+            <w:tcW w:type="dxa" w:w="794"/>
+          </w:tcPr>
+          <w:p>
+            <w:pPr>
+              <w:spacing w:after="20"/>
+            </w:pPr>
+            <w:r/>
+            <w:r>
+              <w:rPr>
+                <w:sz w:val="18"/>
+              </w:rPr>
+              <w:t>☐ PASS</w:t>
+              <w:br/>
+              <w:t>☐ FAIL</w:t>
+            </w:r>
+          </w:p>
+        </w:tc>
+      </w:tr>
+      <w:tr>
+        <w:tc>
+          <w:tcPr>
+            <w:tcW w:type="dxa" w:w="794"/>
+          </w:tcPr>
+          <w:p>
+            <w:pPr>
+              <w:spacing w:after="20"/>
+            </w:pPr>
+            <w:r/>
+            <w:r>
+              <w:rPr>
+                <w:sz w:val="18"/>
+              </w:rPr>
+              <w:t>M-09</w:t>
+            </w:r>
+          </w:p>
+        </w:tc>
+        <w:tc>
+          <w:tcPr>
+            <w:tcW w:type="dxa" w:w="1587"/>
+          </w:tcPr>
+          <w:p>
+            <w:pPr>
+              <w:spacing w:after="20"/>
+            </w:pPr>
+            <w:r/>
+            <w:r>
+              <w:rPr>
+                <w:sz w:val="18"/>
+              </w:rPr>
+              <w:t>Без сети</w:t>
+            </w:r>
+          </w:p>
+        </w:tc>
+        <w:tc>
+          <w:tcPr>
+            <w:tcW w:type="dxa" w:w="1587"/>
+          </w:tcPr>
+          <w:p>
+            <w:pPr>
+              <w:spacing w:after="20"/>
+            </w:pPr>
+            <w:r/>
+            <w:r>
+              <w:rPr>
+                <w:sz w:val="18"/>
+              </w:rPr>
+              <w:t>Режим полёта</w:t>
+            </w:r>
+          </w:p>
+        </w:tc>
+        <w:tc>
+          <w:tcPr>
+            <w:tcW w:type="dxa" w:w="3061"/>
+          </w:tcPr>
+          <w:p>
+            <w:pPr>
+              <w:spacing w:after="20"/>
+            </w:pPr>
+            <w:r/>
+            <w:r>
+              <w:rPr>
+                <w:sz w:val="18"/>
+              </w:rPr>
+              <w:t>1. Открыть «Сегодня», нажать «Поговорить с бадди»</w:t>
+            </w:r>
+          </w:p>
+          <w:p>
+            <w:pPr>
+              <w:spacing w:after="20"/>
+            </w:pPr>
+            <w:r>
+              <w:rPr>
+                <w:sz w:val="18"/>
+              </w:rPr>
+              <w:t>2. Включить сеть, начать разговор, на середине выключить сеть и сказать реплику</w:t>
+            </w:r>
+          </w:p>
+        </w:tc>
+        <w:tc>
+          <w:tcPr>
+            <w:tcW w:type="dxa" w:w="2381"/>
+          </w:tcPr>
+          <w:p>
+            <w:pPr>
+              <w:spacing w:after="20"/>
+            </w:pPr>
+            <w:r/>
+            <w:r>
+              <w:rPr>
+                <w:sz w:val="18"/>
+              </w:rPr>
+              <w:t>Без сети разговор не открывается или сразу сообщает, что нужна сеть, без падения. При потере сети посреди разговора после «Думаю» появляется короткое сообщение и «Ваш ход»; прошлые реплики на месте; после возврата сети следующая реплика проходит</w:t>
+            </w:r>
+          </w:p>
+        </w:tc>
+        <w:tc>
+          <w:tcPr>
+            <w:tcW w:type="dxa" w:w="794"/>
+          </w:tcPr>
+          <w:p>
+            <w:pPr>
+              <w:spacing w:after="20"/>
+            </w:pPr>
+            <w:r/>
+            <w:r>
+              <w:rPr>
+                <w:sz w:val="18"/>
+              </w:rPr>
+              <w:t>☐ PASS</w:t>
+              <w:br/>
+              <w:t>☐ FAIL</w:t>
+            </w:r>
+          </w:p>
+        </w:tc>
+      </w:tr>
+      <w:tr>
+        <w:tc>
+          <w:tcPr>
+            <w:tcW w:type="dxa" w:w="794"/>
+          </w:tcPr>
+          <w:p>
+            <w:pPr>
+              <w:spacing w:after="20"/>
+            </w:pPr>
+            <w:r/>
+            <w:r>
+              <w:rPr>
+                <w:sz w:val="18"/>
+              </w:rPr>
+              <w:t>M-10</w:t>
+            </w:r>
+          </w:p>
+        </w:tc>
+        <w:tc>
+          <w:tcPr>
+            <w:tcW w:type="dxa" w:w="1587"/>
+          </w:tcPr>
+          <w:p>
+            <w:pPr>
+              <w:spacing w:after="20"/>
+            </w:pPr>
+            <w:r/>
+            <w:r>
+              <w:rPr>
+                <w:sz w:val="18"/>
+              </w:rPr>
+              <w:t>Голос недоступен</w:t>
+            </w:r>
+          </w:p>
+        </w:tc>
+        <w:tc>
+          <w:tcPr>
+            <w:tcW w:type="dxa" w:w="1587"/>
+          </w:tcPr>
+          <w:p>
+            <w:pPr>
+              <w:spacing w:after="20"/>
+            </w:pPr>
+            <w:r/>
+            <w:r>
+              <w:rPr>
+                <w:sz w:val="18"/>
+              </w:rPr>
+              <w:t>Разрешение на микрофон отклонено или голос выключен у предмета</w:t>
+            </w:r>
+          </w:p>
+        </w:tc>
+        <w:tc>
+          <w:tcPr>
+            <w:tcW w:type="dxa" w:w="3061"/>
+          </w:tcPr>
+          <w:p>
+            <w:pPr>
+              <w:spacing w:after="20"/>
+            </w:pPr>
+            <w:r/>
+            <w:r>
+              <w:rPr>
+                <w:sz w:val="18"/>
+              </w:rPr>
+              <w:t>1. Открыть «Сегодня»</w:t>
+            </w:r>
+          </w:p>
+        </w:tc>
+        <w:tc>
+          <w:tcPr>
+            <w:tcW w:type="dxa" w:w="2381"/>
+          </w:tcPr>
+          <w:p>
+            <w:pPr>
+              <w:spacing w:after="20"/>
+            </w:pPr>
+            <w:r/>
+            <w:r>
+              <w:rPr>
+                <w:sz w:val="18"/>
+              </w:rPr>
+              <w:t>Строки «Поговорить с бадди» нет; остальное приложение работает как раньше (голос никогда не блокирует)</w:t>
+            </w:r>
+          </w:p>
+        </w:tc>
+        <w:tc>
+          <w:tcPr>
+            <w:tcW w:type="dxa" w:w="794"/>
+          </w:tcPr>
+          <w:p>
+            <w:pPr>
+              <w:spacing w:after="20"/>
+            </w:pPr>
+            <w:r/>
+            <w:r>
+              <w:rPr>
+                <w:sz w:val="18"/>
+              </w:rPr>
+              <w:t>☐ PASS</w:t>
+              <w:br/>
+              <w:t>☐ FAIL</w:t>
+            </w:r>
+          </w:p>
+        </w:tc>
+      </w:tr>
+      <w:tr>
+        <w:tc>
+          <w:tcPr>
+            <w:tcW w:type="dxa" w:w="794"/>
+          </w:tcPr>
+          <w:p>
+            <w:pPr>
+              <w:spacing w:after="20"/>
+            </w:pPr>
+            <w:r/>
+            <w:r>
+              <w:rPr>
+                <w:sz w:val="18"/>
+              </w:rPr>
+              <w:t>M-11</w:t>
+            </w:r>
+          </w:p>
+        </w:tc>
+        <w:tc>
+          <w:tcPr>
+            <w:tcW w:type="dxa" w:w="1587"/>
+          </w:tcPr>
+          <w:p>
+            <w:pPr>
+              <w:spacing w:after="20"/>
+            </w:pPr>
+            <w:r/>
+            <w:r>
+              <w:rPr>
+                <w:sz w:val="18"/>
+              </w:rPr>
+              <w:t>Выход и повторный вход</w:t>
+            </w:r>
+          </w:p>
+        </w:tc>
+        <w:tc>
+          <w:tcPr>
+            <w:tcW w:type="dxa" w:w="1587"/>
+          </w:tcPr>
+          <w:p>
+            <w:pPr>
+              <w:spacing w:after="20"/>
+            </w:pPr>
+            <w:r/>
+            <w:r>
+              <w:rPr>
+                <w:sz w:val="18"/>
+              </w:rPr>
+              <w:t>Идёт разговор</w:t>
+            </w:r>
+          </w:p>
+        </w:tc>
+        <w:tc>
+          <w:tcPr>
+            <w:tcW w:type="dxa" w:w="3061"/>
+          </w:tcPr>
+          <w:p>
+            <w:pPr>
+              <w:spacing w:after="20"/>
+            </w:pPr>
+            <w:r/>
+            <w:r>
+              <w:rPr>
+                <w:sz w:val="18"/>
+              </w:rPr>
+              <w:t>1. Нажать крестик</w:t>
+            </w:r>
+          </w:p>
+          <w:p>
+            <w:pPr>
+              <w:spacing w:after="20"/>
+            </w:pPr>
+            <w:r>
+              <w:rPr>
+                <w:sz w:val="18"/>
+              </w:rPr>
+              <w:t>2. Снова открыть «Поговорить с бадди»</w:t>
+            </w:r>
+          </w:p>
+        </w:tc>
+        <w:tc>
+          <w:tcPr>
+            <w:tcW w:type="dxa" w:w="2381"/>
+          </w:tcPr>
+          <w:p>
+            <w:pPr>
+              <w:spacing w:after="20"/>
+            </w:pPr>
+            <w:r/>
+            <w:r>
+              <w:rPr>
+                <w:sz w:val="18"/>
+              </w:rPr>
+              <w:t>Возврат на «Сегодня» без подтверждения; озвучка и запись остановлены. Новый вход начинает новый разговор с новой первой реплики, старая лента не показывается</w:t>
+            </w:r>
+          </w:p>
+        </w:tc>
+        <w:tc>
+          <w:tcPr>
+            <w:tcW w:type="dxa" w:w="794"/>
+          </w:tcPr>
+          <w:p>
+            <w:pPr>
+              <w:spacing w:after="20"/>
+            </w:pPr>
+            <w:r/>
+            <w:r>
+              <w:rPr>
+                <w:sz w:val="18"/>
+              </w:rPr>
+              <w:t>☐ PASS</w:t>
+              <w:br/>
+              <w:t>☐ FAIL</w:t>
+            </w:r>
+          </w:p>
+        </w:tc>
+      </w:tr>
+      <w:tr>
+        <w:tc>
+          <w:tcPr>
+            <w:tcW w:type="dxa" w:w="794"/>
+          </w:tcPr>
+          <w:p>
+            <w:pPr>
+              <w:spacing w:after="20"/>
+            </w:pPr>
+            <w:r/>
+            <w:r>
+              <w:rPr>
+                <w:sz w:val="18"/>
+              </w:rPr>
+              <w:t>M-12</w:t>
+            </w:r>
+          </w:p>
+        </w:tc>
+        <w:tc>
+          <w:tcPr>
+            <w:tcW w:type="dxa" w:w="1587"/>
+          </w:tcPr>
+          <w:p>
+            <w:pPr>
+              <w:spacing w:after="20"/>
+            </w:pPr>
+            <w:r/>
+            <w:r>
+              <w:rPr>
+                <w:sz w:val="18"/>
+              </w:rPr>
+              <w:t>Записи из разговора</w:t>
+            </w:r>
+          </w:p>
+        </w:tc>
+        <w:tc>
+          <w:tcPr>
+            <w:tcW w:type="dxa" w:w="1587"/>
+          </w:tcPr>
+          <w:p>
+            <w:pPr>
+              <w:spacing w:after="20"/>
+            </w:pPr>
+            <w:r/>
+            <w:r>
+              <w:rPr>
+                <w:sz w:val="18"/>
+              </w:rPr>
+              <w:t>FR-68 реализовано; разговор, в котором бадди поправил ошибку</w:t>
+            </w:r>
+          </w:p>
+        </w:tc>
+        <w:tc>
+          <w:tcPr>
+            <w:tcW w:type="dxa" w:w="3061"/>
+          </w:tcPr>
+          <w:p>
+            <w:pPr>
+              <w:spacing w:after="20"/>
+            </w:pPr>
+            <w:r/>
+            <w:r>
+              <w:rPr>
+                <w:sz w:val="18"/>
+              </w:rPr>
+              <w:t>1. Завершить разговор</w:t>
+            </w:r>
+          </w:p>
+          <w:p>
+            <w:pPr>
+              <w:spacing w:after="20"/>
+            </w:pPr>
+            <w:r>
+              <w:rPr>
+                <w:sz w:val="18"/>
+              </w:rPr>
+              <w:t>2. Пройти следующий урок и открыть разбор</w:t>
+            </w:r>
+          </w:p>
+          <w:p>
+            <w:pPr>
+              <w:spacing w:after="20"/>
+            </w:pPr>
+            <w:r>
+              <w:rPr>
+                <w:sz w:val="18"/>
+              </w:rPr>
+              <w:t>3. Открыть «Повторы»</w:t>
+            </w:r>
+          </w:p>
+        </w:tc>
+        <w:tc>
+          <w:tcPr>
+            <w:tcW w:type="dxa" w:w="2381"/>
+          </w:tcPr>
+          <w:p>
+            <w:pPr>
+              <w:spacing w:after="20"/>
+            </w:pPr>
+            <w:r/>
+            <w:r>
+              <w:rPr>
+                <w:sz w:val="18"/>
+              </w:rPr>
+              <w:t>Следующий урок учитывает ошибку из разговора; в разборе или повторах появляется запись с пометкой «разговор». Если FR-68 ещё нет в build, кейс пропускается</w:t>
+            </w:r>
+          </w:p>
+        </w:tc>
+        <w:tc>
+          <w:tcPr>
+            <w:tcW w:type="dxa" w:w="794"/>
+          </w:tcPr>
+          <w:p>
+            <w:pPr>
+              <w:spacing w:after="20"/>
+            </w:pPr>
+            <w:r/>
+            <w:r>
+              <w:rPr>
+                <w:sz w:val="18"/>
+              </w:rPr>
+              <w:t>☐ PASS</w:t>
+              <w:br/>
+              <w:t>☐ FAIL</w:t>
+            </w:r>
+          </w:p>
+        </w:tc>
+      </w:tr>
+      <w:tr>
+        <w:tc>
+          <w:tcPr>
+            <w:tcW w:type="dxa" w:w="794"/>
+          </w:tcPr>
+          <w:p>
+            <w:pPr>
+              <w:spacing w:after="20"/>
+            </w:pPr>
+            <w:r/>
+            <w:r>
+              <w:rPr>
+                <w:sz w:val="18"/>
+              </w:rPr>
+              <w:t>M-13</w:t>
+            </w:r>
+          </w:p>
+        </w:tc>
+        <w:tc>
+          <w:tcPr>
+            <w:tcW w:type="dxa" w:w="1587"/>
+          </w:tcPr>
+          <w:p>
+            <w:pPr>
+              <w:spacing w:after="20"/>
+            </w:pPr>
+            <w:r/>
+            <w:r>
+              <w:rPr>
+                <w:sz w:val="18"/>
+              </w:rPr>
+              <w:t>Звонок и фон</w:t>
+            </w:r>
+          </w:p>
+        </w:tc>
+        <w:tc>
+          <w:tcPr>
+            <w:tcW w:type="dxa" w:w="1587"/>
+          </w:tcPr>
+          <w:p>
+            <w:pPr>
+              <w:spacing w:after="20"/>
+            </w:pPr>
+            <w:r/>
+            <w:r>
+              <w:rPr>
+                <w:sz w:val="18"/>
+              </w:rPr>
+              <w:t>Идёт запись реплики</w:t>
+            </w:r>
+          </w:p>
+        </w:tc>
+        <w:tc>
+          <w:tcPr>
+            <w:tcW w:type="dxa" w:w="3061"/>
+          </w:tcPr>
+          <w:p>
+            <w:pPr>
+              <w:spacing w:after="20"/>
+            </w:pPr>
+            <w:r/>
+            <w:r>
+              <w:rPr>
+                <w:sz w:val="18"/>
+              </w:rPr>
+              <w:t>1. Свернуть приложение или принять входящий звонок</w:t>
+            </w:r>
+          </w:p>
+          <w:p>
+            <w:pPr>
+              <w:spacing w:after="20"/>
+            </w:pPr>
+            <w:r>
+              <w:rPr>
+                <w:sz w:val="18"/>
+              </w:rPr>
+              <w:t>2. Вернуться в приложение</w:t>
+            </w:r>
+          </w:p>
+        </w:tc>
+        <w:tc>
+          <w:tcPr>
+            <w:tcW w:type="dxa" w:w="2381"/>
+          </w:tcPr>
+          <w:p>
+            <w:pPr>
+              <w:spacing w:after="20"/>
+            </w:pPr>
+            <w:r/>
+            <w:r>
+              <w:rPr>
+                <w:sz w:val="18"/>
+              </w:rPr>
+              <w:t>Запись остановлена, док «Ваш ход», ничего не озвучивается дважды; приложение не падает; можно продолжить разговор</w:t>
+            </w:r>
+          </w:p>
+        </w:tc>
+        <w:tc>
+          <w:tcPr>
+            <w:tcW w:type="dxa" w:w="794"/>
+          </w:tcPr>
+          <w:p>
+            <w:pPr>
+              <w:spacing w:after="20"/>
+            </w:pPr>
+            <w:r/>
+            <w:r>
+              <w:rPr>
+                <w:sz w:val="18"/>
+              </w:rPr>
+              <w:t>☐ PASS</w:t>
+              <w:br/>
+              <w:t>☐ FAIL</w:t>
+            </w:r>
+          </w:p>
+        </w:tc>
+      </w:tr>
+      <w:tr>
+        <w:tc>
+          <w:tcPr>
+            <w:tcW w:type="dxa" w:w="794"/>
+          </w:tcPr>
+          <w:p>
+            <w:pPr>
+              <w:spacing w:after="20"/>
+            </w:pPr>
+            <w:r/>
+            <w:r>
+              <w:rPr>
+                <w:sz w:val="18"/>
+              </w:rPr>
+              <w:t>M-14</w:t>
+            </w:r>
+          </w:p>
+        </w:tc>
+        <w:tc>
+          <w:tcPr>
+            <w:tcW w:type="dxa" w:w="1587"/>
+          </w:tcPr>
+          <w:p>
+            <w:pPr>
+              <w:spacing w:after="20"/>
+            </w:pPr>
+            <w:r/>
+            <w:r>
+              <w:rPr>
+                <w:sz w:val="18"/>
+              </w:rPr>
+              <w:t>Тёмная тема и «Уменьшение движения»</w:t>
+            </w:r>
+          </w:p>
+        </w:tc>
+        <w:tc>
+          <w:tcPr>
+            <w:tcW w:type="dxa" w:w="1587"/>
+          </w:tcPr>
+          <w:p>
+            <w:pPr>
+              <w:spacing w:after="20"/>
+            </w:pPr>
+            <w:r/>
+            <w:r>
+              <w:rPr>
+                <w:sz w:val="18"/>
+              </w:rPr>
+              <w:t>Открыт разговор</w:t>
+            </w:r>
+          </w:p>
+        </w:tc>
+        <w:tc>
+          <w:tcPr>
+            <w:tcW w:type="dxa" w:w="3061"/>
+          </w:tcPr>
+          <w:p>
+            <w:pPr>
+              <w:spacing w:after="20"/>
+            </w:pPr>
+            <w:r/>
+            <w:r>
+              <w:rPr>
+                <w:sz w:val="18"/>
+              </w:rPr>
+              <w:t>1. Профиль → тема «Тёмная», открыть разговор</w:t>
+            </w:r>
+          </w:p>
+          <w:p>
+            <w:pPr>
+              <w:spacing w:after="20"/>
+            </w:pPr>
+            <w:r>
+              <w:rPr>
+                <w:sz w:val="18"/>
+              </w:rPr>
+              <w:t>2. Включить «Уменьшение движения» в iOS, открыть разговор</w:t>
+            </w:r>
+          </w:p>
+        </w:tc>
+        <w:tc>
+          <w:tcPr>
+            <w:tcW w:type="dxa" w:w="2381"/>
+          </w:tcPr>
+          <w:p>
+            <w:pPr>
+              <w:spacing w:after="20"/>
+            </w:pPr>
+            <w:r/>
+            <w:r>
+              <w:rPr>
+                <w:sz w:val="18"/>
+              </w:rPr>
+              <w:t>В тёмной теме фон, карточки, рамка ответа и микрофон читаются, кольцо бадди янтарное. При уменьшении движения точки не двигаются, меняются только слово в доке, цвет микрофона и текст</w:t>
+            </w:r>
+          </w:p>
+        </w:tc>
+        <w:tc>
+          <w:tcPr>
+            <w:tcW w:type="dxa" w:w="794"/>
+          </w:tcPr>
+          <w:p>
+            <w:pPr>
+              <w:spacing w:after="20"/>
+            </w:pPr>
+            <w:r/>
+            <w:r>
+              <w:rPr>
+                <w:sz w:val="18"/>
+              </w:rPr>
+              <w:t>☐ PASS</w:t>
+              <w:br/>
+              <w:t>☐ FAIL</w:t>
+            </w:r>
+          </w:p>
+        </w:tc>
+      </w:tr>
+    </w:tbl>
+    <w:p>
+      <w:pPr>
+        <w:spacing w:after="40"/>
+      </w:pPr>
+    </w:p>
+    <w:p>
+      <w:pPr>
         <w:pStyle w:val="Heading1"/>
       </w:pPr>
       <w:r>
@@ -13390,6 +15156,24 @@
       </w:pPr>
       <w:r>
         <w:t>Подсказка «Есть сборка N» не появляется, если установлена последняя сборка или сервер недоступен.</w:t>
+      </w:r>
+    </w:p>
+    <w:p>
+      <w:pPr>
+        <w:pStyle w:val="ListBullet"/>
+        <w:spacing w:after="40"/>
+      </w:pPr>
+      <w:r>
+        <w:t>Бадди в разговоре обращается на «ты», а интерфейс на «вы»: так задумано, это характер персонажа.</w:t>
+      </w:r>
+    </w:p>
+    <w:p>
+      <w:pPr>
+        <w:pStyle w:val="ListBullet"/>
+        <w:spacing w:after="40"/>
+      </w:pPr>
+      <w:r>
+        <w:t>Голос бадди в разговоре системный (как у озвучки примеров) и может звучать механически; выбор нейроголоса — настройка iOS, не приложения.</w:t>
       </w:r>
     </w:p>
     <w:p>

</xml_diff>

<commit_message>
QA docs: section 5.13 applies from build 19, doc v1.3
Co-Authored-By: Claude Fable 5.1 <noreply@anthropic.com>
</commit_message>
<xml_diff>
--- a/docs/qa/Teach — тестовая документация QA.docx
+++ b/docs/qa/Teach — тестовая документация QA.docx
@@ -111,7 +111,7 @@
               <w:rPr>
                 <w:sz w:val="19"/>
               </w:rPr>
-              <w:t>1.2 · 14 сентября 2026</w:t>
+              <w:t>1.3 · 15 сентября 2026</w:t>
             </w:r>
           </w:p>
         </w:tc>
@@ -147,7 +147,7 @@
               <w:rPr>
                 <w:sz w:val="19"/>
               </w:rPr>
-              <w:t>Teach 0.1.0, build 13 в TestFlight (или новее — номер build указывайте в bug report)</w:t>
+              <w:t>Teach 0.1.0, build 19 в TestFlight (или новее — номер build указывайте в bug report)</w:t>
             </w:r>
           </w:p>
         </w:tc>
@@ -12865,7 +12865,7 @@
           <w:b w:val="0"/>
           <w:i w:val="0"/>
         </w:rPr>
-        <w:t>Раздел для сборки, в которой появится голосовой разговор с бадди (FRD: FR-66…68, SR-16). Пока функции нет в build, раздел пропускается; в bug report указывайте номер build, где она появилась. Разговор идёт так: платформенное распознавание → текст на сервер → ответ бадди озвучивается системным голосом. Бадди обращается на «ты» — это характер персонажа, не bug.</w:t>
+        <w:t>Раздел действует начиная со сборки 19 (FRD: FR-66…68, SR-16). В bug report указывайте номер build. Разговор идёт так: платформенное распознавание → текст на сервер → ответ бадди озвучивается системным голосом. Бадди обращается на «ты» — это характер персонажа, не bug. M-12 пропускается, пока не реализован FR-68.</w:t>
       </w:r>
     </w:p>
     <w:tbl>

</xml_diff>

<commit_message>
QA docs: section 5.13 applies from build 20, doc v1.4
Co-Authored-By: Claude Fable 5.1 <noreply@anthropic.com>
</commit_message>
<xml_diff>
--- a/docs/qa/Teach — тестовая документация QA.docx
+++ b/docs/qa/Teach — тестовая документация QA.docx
@@ -111,7 +111,7 @@
               <w:rPr>
                 <w:sz w:val="19"/>
               </w:rPr>
-              <w:t>1.3 · 15 сентября 2026</w:t>
+              <w:t>1.4 · 15 сентября 2026</w:t>
             </w:r>
           </w:p>
         </w:tc>
@@ -147,7 +147,7 @@
               <w:rPr>
                 <w:sz w:val="19"/>
               </w:rPr>
-              <w:t>Teach 0.1.0, build 19 в TestFlight (или новее — номер build указывайте в bug report)</w:t>
+              <w:t>Teach 0.1.0, build 20 в TestFlight (или новее — номер build указывайте в bug report)</w:t>
             </w:r>
           </w:p>
         </w:tc>
@@ -12865,7 +12865,7 @@
           <w:b w:val="0"/>
           <w:i w:val="0"/>
         </w:rPr>
-        <w:t>Раздел действует начиная со сборки 19 (FRD: FR-66…68, SR-16). В bug report указывайте номер build. Разговор идёт так: платформенное распознавание → текст на сервер → ответ бадди озвучивается системным голосом. Бадди обращается на «ты» — это характер персонажа, не bug. M-12 пропускается, пока не реализован FR-68.</w:t>
+        <w:t>Раздел действует начиная со сборки 20 (FRD: FR-66…68, SR-16). В bug report указывайте номер build. Разговор идёт так: платформенное распознавание → текст на сервер → ответ бадди озвучивается системным голосом. Бадди обращается на «ты» — это характер персонажа, не bug. M-12 пропускается, пока не реализован FR-68.</w:t>
       </w:r>
     </w:p>
     <w:tbl>

</xml_diff>

<commit_message>
QA docs: cases M-15…M-17 (silent switch, bilingual reply, demo talk), doc v1.5, 98 cases
Co-Authored-By: Claude Fable 5.1 <noreply@anthropic.com>
</commit_message>
<xml_diff>
--- a/docs/qa/Teach — тестовая документация QA.docx
+++ b/docs/qa/Teach — тестовая документация QA.docx
@@ -111,7 +111,7 @@
               <w:rPr>
                 <w:sz w:val="19"/>
               </w:rPr>
-              <w:t>1.4 · 15 сентября 2026</w:t>
+              <w:t>1.5 · 15 сентября 2026</w:t>
             </w:r>
           </w:p>
         </w:tc>
@@ -14608,6 +14608,423 @@
           </w:p>
         </w:tc>
       </w:tr>
+      <w:tr>
+        <w:tc>
+          <w:tcPr>
+            <w:tcW w:type="dxa" w:w="794"/>
+          </w:tcPr>
+          <w:p>
+            <w:pPr>
+              <w:spacing w:after="20"/>
+            </w:pPr>
+            <w:r/>
+            <w:r>
+              <w:rPr>
+                <w:sz w:val="18"/>
+              </w:rPr>
+              <w:t>M-15</w:t>
+            </w:r>
+          </w:p>
+        </w:tc>
+        <w:tc>
+          <w:tcPr>
+            <w:tcW w:type="dxa" w:w="1587"/>
+          </w:tcPr>
+          <w:p>
+            <w:pPr>
+              <w:spacing w:after="20"/>
+            </w:pPr>
+            <w:r/>
+            <w:r>
+              <w:rPr>
+                <w:sz w:val="18"/>
+              </w:rPr>
+              <w:t>Звук при переключателе «Без звука»</w:t>
+            </w:r>
+          </w:p>
+        </w:tc>
+        <w:tc>
+          <w:tcPr>
+            <w:tcW w:type="dxa" w:w="1587"/>
+          </w:tcPr>
+          <w:p>
+            <w:pPr>
+              <w:spacing w:after="20"/>
+            </w:pPr>
+            <w:r/>
+            <w:r>
+              <w:rPr>
+                <w:sz w:val="18"/>
+              </w:rPr>
+              <w:t>Переключатель «Без звука» на телефоне включён, наушники отключены</w:t>
+            </w:r>
+          </w:p>
+        </w:tc>
+        <w:tc>
+          <w:tcPr>
+            <w:tcW w:type="dxa" w:w="3061"/>
+          </w:tcPr>
+          <w:p>
+            <w:pPr>
+              <w:spacing w:after="20"/>
+            </w:pPr>
+            <w:r/>
+            <w:r>
+              <w:rPr>
+                <w:sz w:val="18"/>
+              </w:rPr>
+              <w:t>1. Открыть «Поговорить с бадди»</w:t>
+            </w:r>
+          </w:p>
+          <w:p>
+            <w:pPr>
+              <w:spacing w:after="20"/>
+            </w:pPr>
+            <w:r>
+              <w:rPr>
+                <w:sz w:val="18"/>
+              </w:rPr>
+              <w:t>2. Дождаться вступления</w:t>
+            </w:r>
+          </w:p>
+          <w:p>
+            <w:pPr>
+              <w:spacing w:after="20"/>
+            </w:pPr>
+            <w:r>
+              <w:rPr>
+                <w:sz w:val="18"/>
+              </w:rPr>
+              <w:t>3. Сказать реплику и дождаться ответа</w:t>
+            </w:r>
+          </w:p>
+          <w:p>
+            <w:pPr>
+              <w:spacing w:after="20"/>
+            </w:pPr>
+            <w:r>
+              <w:rPr>
+                <w:sz w:val="18"/>
+              </w:rPr>
+              <w:t>4. Выйти крестиком и запустить озвучку примера в уроке</w:t>
+            </w:r>
+          </w:p>
+        </w:tc>
+        <w:tc>
+          <w:tcPr>
+            <w:tcW w:type="dxa" w:w="2381"/>
+          </w:tcPr>
+          <w:p>
+            <w:pPr>
+              <w:spacing w:after="20"/>
+            </w:pPr>
+            <w:r/>
+            <w:r>
+              <w:rPr>
+                <w:sz w:val="18"/>
+              </w:rPr>
+              <w:t>Вступление и ответы бадди слышны из громкого динамика телефона, несмотря на переключатель; громкость регулируется боковыми кнопками. После выхода приложение работает как раньше</w:t>
+            </w:r>
+          </w:p>
+        </w:tc>
+        <w:tc>
+          <w:tcPr>
+            <w:tcW w:type="dxa" w:w="794"/>
+          </w:tcPr>
+          <w:p>
+            <w:pPr>
+              <w:spacing w:after="20"/>
+            </w:pPr>
+            <w:r/>
+            <w:r>
+              <w:rPr>
+                <w:sz w:val="18"/>
+              </w:rPr>
+              <w:t>☐ PASS</w:t>
+              <w:br/>
+              <w:t>☐ FAIL</w:t>
+            </w:r>
+          </w:p>
+        </w:tc>
+      </w:tr>
+      <w:tr>
+        <w:tc>
+          <w:tcPr>
+            <w:tcW w:type="dxa" w:w="794"/>
+          </w:tcPr>
+          <w:p>
+            <w:pPr>
+              <w:spacing w:after="20"/>
+            </w:pPr>
+            <w:r/>
+            <w:r>
+              <w:rPr>
+                <w:sz w:val="18"/>
+              </w:rPr>
+              <w:t>M-16</w:t>
+            </w:r>
+          </w:p>
+        </w:tc>
+        <w:tc>
+          <w:tcPr>
+            <w:tcW w:type="dxa" w:w="1587"/>
+          </w:tcPr>
+          <w:p>
+            <w:pPr>
+              <w:spacing w:after="20"/>
+            </w:pPr>
+            <w:r/>
+            <w:r>
+              <w:rPr>
+                <w:sz w:val="18"/>
+              </w:rPr>
+              <w:t>Двуязычная реплика: текст и голос</w:t>
+            </w:r>
+          </w:p>
+        </w:tc>
+        <w:tc>
+          <w:tcPr>
+            <w:tcW w:type="dxa" w:w="1587"/>
+          </w:tcPr>
+          <w:p>
+            <w:pPr>
+              <w:spacing w:after="20"/>
+            </w:pPr>
+            <w:r/>
+            <w:r>
+              <w:rPr>
+                <w:sz w:val="18"/>
+              </w:rPr>
+              <w:t>Языковой предмет («Английский» демо или «Итальянский»)</w:t>
+            </w:r>
+          </w:p>
+        </w:tc>
+        <w:tc>
+          <w:tcPr>
+            <w:tcW w:type="dxa" w:w="3061"/>
+          </w:tcPr>
+          <w:p>
+            <w:pPr>
+              <w:spacing w:after="20"/>
+            </w:pPr>
+            <w:r/>
+            <w:r>
+              <w:rPr>
+                <w:sz w:val="18"/>
+              </w:rPr>
+              <w:t>1. Прочитать реплику бадди в ленте</w:t>
+            </w:r>
+          </w:p>
+          <w:p>
+            <w:pPr>
+              <w:spacing w:after="20"/>
+            </w:pPr>
+            <w:r>
+              <w:rPr>
+                <w:sz w:val="18"/>
+              </w:rPr>
+              <w:t>2. Послушать, что произносится</w:t>
+            </w:r>
+          </w:p>
+          <w:p>
+            <w:pPr>
+              <w:spacing w:after="20"/>
+            </w:pPr>
+            <w:r>
+              <w:rPr>
+                <w:sz w:val="18"/>
+              </w:rPr>
+              <w:t>3. Ответить на языке предмета с ошибкой</w:t>
+            </w:r>
+          </w:p>
+          <w:p>
+            <w:pPr>
+              <w:spacing w:after="20"/>
+            </w:pPr>
+            <w:r>
+              <w:rPr>
+                <w:sz w:val="18"/>
+              </w:rPr>
+              <w:t>4. Сравнить текст и голос ещё в двух репликах</w:t>
+            </w:r>
+          </w:p>
+        </w:tc>
+        <w:tc>
+          <w:tcPr>
+            <w:tcW w:type="dxa" w:w="2381"/>
+          </w:tcPr>
+          <w:p>
+            <w:pPr>
+              <w:spacing w:after="20"/>
+            </w:pPr>
+            <w:r/>
+            <w:r>
+              <w:rPr>
+                <w:sz w:val="18"/>
+              </w:rPr>
+              <w:t>В тексте есть и русское, и иностранное: пояснения и подсказки по-русски, фразы собеседника на языке предмета. Голосом звучат только иностранные куски, русский текст не проговаривается; в каждой реплике есть хотя бы одна иностранная фраза; бадди не переводит свою фразу дословно на русский. Поправка ошибки написана по-русски, повторить просит на языке предмета</w:t>
+            </w:r>
+          </w:p>
+        </w:tc>
+        <w:tc>
+          <w:tcPr>
+            <w:tcW w:type="dxa" w:w="794"/>
+          </w:tcPr>
+          <w:p>
+            <w:pPr>
+              <w:spacing w:after="20"/>
+            </w:pPr>
+            <w:r/>
+            <w:r>
+              <w:rPr>
+                <w:sz w:val="18"/>
+              </w:rPr>
+              <w:t>☐ PASS</w:t>
+              <w:br/>
+              <w:t>☐ FAIL</w:t>
+            </w:r>
+          </w:p>
+        </w:tc>
+      </w:tr>
+      <w:tr>
+        <w:tc>
+          <w:tcPr>
+            <w:tcW w:type="dxa" w:w="794"/>
+          </w:tcPr>
+          <w:p>
+            <w:pPr>
+              <w:spacing w:after="20"/>
+            </w:pPr>
+            <w:r/>
+            <w:r>
+              <w:rPr>
+                <w:sz w:val="18"/>
+              </w:rPr>
+              <w:t>M-17</w:t>
+            </w:r>
+          </w:p>
+        </w:tc>
+        <w:tc>
+          <w:tcPr>
+            <w:tcW w:type="dxa" w:w="1587"/>
+          </w:tcPr>
+          <w:p>
+            <w:pPr>
+              <w:spacing w:after="20"/>
+            </w:pPr>
+            <w:r/>
+            <w:r>
+              <w:rPr>
+                <w:sz w:val="18"/>
+              </w:rPr>
+              <w:t>Разговор в демо «Английский»</w:t>
+            </w:r>
+          </w:p>
+        </w:tc>
+        <w:tc>
+          <w:tcPr>
+            <w:tcW w:type="dxa" w:w="1587"/>
+          </w:tcPr>
+          <w:p>
+            <w:pPr>
+              <w:spacing w:after="20"/>
+            </w:pPr>
+            <w:r/>
+            <w:r>
+              <w:rPr>
+                <w:sz w:val="18"/>
+              </w:rPr>
+              <w:t>Демо-предмет «Английский» на «Сегодня», голос доступен</w:t>
+            </w:r>
+          </w:p>
+        </w:tc>
+        <w:tc>
+          <w:tcPr>
+            <w:tcW w:type="dxa" w:w="3061"/>
+          </w:tcPr>
+          <w:p>
+            <w:pPr>
+              <w:spacing w:after="20"/>
+            </w:pPr>
+            <w:r/>
+            <w:r>
+              <w:rPr>
+                <w:sz w:val="18"/>
+              </w:rPr>
+              <w:t>1. Найти строку «Поговорить с бадди» на карточке «Английский»</w:t>
+            </w:r>
+          </w:p>
+          <w:p>
+            <w:pPr>
+              <w:spacing w:after="20"/>
+            </w:pPr>
+            <w:r>
+              <w:rPr>
+                <w:sz w:val="18"/>
+              </w:rPr>
+              <w:t>2. Открыть разговор</w:t>
+            </w:r>
+          </w:p>
+          <w:p>
+            <w:pPr>
+              <w:spacing w:after="20"/>
+            </w:pPr>
+            <w:r>
+              <w:rPr>
+                <w:sz w:val="18"/>
+              </w:rPr>
+              <w:t>3. Спросить бадди, что уже пройдено, и ответить на пару вопросов</w:t>
+            </w:r>
+          </w:p>
+          <w:p>
+            <w:pPr>
+              <w:spacing w:after="20"/>
+            </w:pPr>
+            <w:r>
+              <w:rPr>
+                <w:sz w:val="18"/>
+              </w:rPr>
+              <w:t>4. Повторить для карточки «Выступления»</w:t>
+            </w:r>
+          </w:p>
+        </w:tc>
+        <w:tc>
+          <w:tcPr>
+            <w:tcW w:type="dxa" w:w="2381"/>
+          </w:tcPr>
+          <w:p>
+            <w:pPr>
+              <w:spacing w:after="20"/>
+            </w:pPr>
+            <w:r/>
+            <w:r>
+              <w:rPr>
+                <w:sz w:val="18"/>
+              </w:rPr>
+              <w:t>Строка есть у обоих демо. В шапке имя предмета и этап демо («Разговор · этап 01», тема этапа). Бадди говорит по теме демо и знает термины из его справочника (например, из глоссария «Английского»). Вступление на английском с русской подсказкой; у «Выступлений» разговор по-русски. Без сети строка «Поговорить» не открывает разговор и приложение не падает</w:t>
+            </w:r>
+          </w:p>
+        </w:tc>
+        <w:tc>
+          <w:tcPr>
+            <w:tcW w:type="dxa" w:w="794"/>
+          </w:tcPr>
+          <w:p>
+            <w:pPr>
+              <w:spacing w:after="20"/>
+            </w:pPr>
+            <w:r/>
+            <w:r>
+              <w:rPr>
+                <w:sz w:val="18"/>
+              </w:rPr>
+              <w:t>☐ PASS</w:t>
+              <w:br/>
+              <w:t>☐ FAIL</w:t>
+            </w:r>
+          </w:p>
+        </w:tc>
+      </w:tr>
     </w:tbl>
     <w:p>
       <w:pPr>
@@ -15174,6 +15591,15 @@
       </w:pPr>
       <w:r>
         <w:t>Голос бадди в разговоре системный (как у озвучки примеров) и может звучать механически; выбор нейроголоса — настройка iOS, не приложения.</w:t>
+      </w:r>
+    </w:p>
+    <w:p>
+      <w:pPr>
+        <w:pStyle w:val="ListBullet"/>
+        <w:spacing w:after="40"/>
+      </w:pPr>
+      <w:r>
+        <w:t>Бадди не проговаривает русский текст реплики: вслух звучат только фразы на языке предмета, русское пояснение читается.</w:t>
       </w:r>
     </w:p>
     <w:p>

</xml_diff>

<commit_message>
Explain why the answer is right (lesson + buddy corrections); cancel a recording in the talk
Co-Authored-By: Claude Fable 5.1 <noreply@anthropic.com>
</commit_message>
<xml_diff>
--- a/docs/qa/Teach — тестовая документация QA.docx
+++ b/docs/qa/Teach — тестовая документация QA.docx
@@ -111,7 +111,7 @@
               <w:rPr>
                 <w:sz w:val="19"/>
               </w:rPr>
-              <w:t>1.5 · 15 сентября 2026</w:t>
+              <w:t>1.6 · 15 сентября 2026</w:t>
             </w:r>
           </w:p>
         </w:tc>
@@ -5770,6 +5770,134 @@
               <w:rPr>
                 <w:sz w:val="18"/>
               </w:rPr>
+              <w:t>D-16</w:t>
+            </w:r>
+          </w:p>
+        </w:tc>
+        <w:tc>
+          <w:tcPr>
+            <w:tcW w:type="dxa" w:w="1587"/>
+          </w:tcPr>
+          <w:p>
+            <w:pPr>
+              <w:spacing w:after="20"/>
+            </w:pPr>
+            <w:r/>
+            <w:r>
+              <w:rPr>
+                <w:sz w:val="18"/>
+              </w:rPr>
+              <w:t>Разбор объясняет, почему верно</w:t>
+            </w:r>
+          </w:p>
+        </w:tc>
+        <w:tc>
+          <w:tcPr>
+            <w:tcW w:type="dxa" w:w="1587"/>
+          </w:tcPr>
+          <w:p>
+            <w:pPr>
+              <w:spacing w:after="20"/>
+            </w:pPr>
+            <w:r/>
+            <w:r>
+              <w:rPr>
+                <w:sz w:val="18"/>
+              </w:rPr>
+              <w:t>Свой предмет, урок с вариантами и вводом</w:t>
+            </w:r>
+          </w:p>
+        </w:tc>
+        <w:tc>
+          <w:tcPr>
+            <w:tcW w:type="dxa" w:w="3061"/>
+          </w:tcPr>
+          <w:p>
+            <w:pPr>
+              <w:spacing w:after="20"/>
+            </w:pPr>
+            <w:r/>
+            <w:r>
+              <w:rPr>
+                <w:sz w:val="18"/>
+              </w:rPr>
+              <w:t>1. Ответить верно на шаге с вариантами</w:t>
+            </w:r>
+          </w:p>
+          <w:p>
+            <w:pPr>
+              <w:spacing w:after="20"/>
+            </w:pPr>
+            <w:r>
+              <w:rPr>
+                <w:sz w:val="18"/>
+              </w:rPr>
+              <w:t>2. Прочитать карточку разбора</w:t>
+            </w:r>
+          </w:p>
+          <w:p>
+            <w:pPr>
+              <w:spacing w:after="20"/>
+            </w:pPr>
+            <w:r>
+              <w:rPr>
+                <w:sz w:val="18"/>
+              </w:rPr>
+              <w:t>3. То же на шаге с вводом</w:t>
+            </w:r>
+          </w:p>
+        </w:tc>
+        <w:tc>
+          <w:tcPr>
+            <w:tcW w:type="dxa" w:w="2381"/>
+          </w:tcPr>
+          <w:p>
+            <w:pPr>
+              <w:spacing w:after="20"/>
+            </w:pPr>
+            <w:r/>
+            <w:r>
+              <w:rPr>
+                <w:sz w:val="18"/>
+              </w:rPr>
+              <w:t>Карточка «Верно» содержит 1–2 фразы о том, почему именно этот ответ правильный (правило, как отличить от похожих), а не только «верно» и не пересказ вопроса</w:t>
+            </w:r>
+          </w:p>
+        </w:tc>
+        <w:tc>
+          <w:tcPr>
+            <w:tcW w:type="dxa" w:w="794"/>
+          </w:tcPr>
+          <w:p>
+            <w:pPr>
+              <w:spacing w:after="20"/>
+            </w:pPr>
+            <w:r/>
+            <w:r>
+              <w:rPr>
+                <w:sz w:val="18"/>
+              </w:rPr>
+              <w:t>☐ PASS</w:t>
+              <w:br/>
+              <w:t>☐ FAIL</w:t>
+            </w:r>
+          </w:p>
+        </w:tc>
+      </w:tr>
+      <w:tr>
+        <w:tc>
+          <w:tcPr>
+            <w:tcW w:type="dxa" w:w="794"/>
+          </w:tcPr>
+          <w:p>
+            <w:pPr>
+              <w:spacing w:after="20"/>
+            </w:pPr>
+            <w:r/>
+            <w:r>
+              <w:rPr>
+                <w:sz w:val="18"/>
+              </w:rPr>
               <w:t>D-11</w:t>
             </w:r>
           </w:p>
@@ -15002,6 +15130,251 @@
                 <w:sz w:val="18"/>
               </w:rPr>
               <w:t>Строка есть у обоих демо. В шапке имя предмета и этап демо («Разговор · этап 01», тема этапа). Бадди говорит по теме демо и знает термины из его справочника (например, из глоссария «Английского»). Вступление на английском с русской подсказкой; у «Выступлений» разговор по-русски. Без сети строка «Поговорить» не открывает разговор и приложение не падает</w:t>
+            </w:r>
+          </w:p>
+        </w:tc>
+        <w:tc>
+          <w:tcPr>
+            <w:tcW w:type="dxa" w:w="794"/>
+          </w:tcPr>
+          <w:p>
+            <w:pPr>
+              <w:spacing w:after="20"/>
+            </w:pPr>
+            <w:r/>
+            <w:r>
+              <w:rPr>
+                <w:sz w:val="18"/>
+              </w:rPr>
+              <w:t>☐ PASS</w:t>
+              <w:br/>
+              <w:t>☐ FAIL</w:t>
+            </w:r>
+          </w:p>
+        </w:tc>
+      </w:tr>
+      <w:tr>
+        <w:tc>
+          <w:tcPr>
+            <w:tcW w:type="dxa" w:w="794"/>
+          </w:tcPr>
+          <w:p>
+            <w:pPr>
+              <w:spacing w:after="20"/>
+            </w:pPr>
+            <w:r/>
+            <w:r>
+              <w:rPr>
+                <w:sz w:val="18"/>
+              </w:rPr>
+              <w:t>M-18</w:t>
+            </w:r>
+          </w:p>
+        </w:tc>
+        <w:tc>
+          <w:tcPr>
+            <w:tcW w:type="dxa" w:w="1587"/>
+          </w:tcPr>
+          <w:p>
+            <w:pPr>
+              <w:spacing w:after="20"/>
+            </w:pPr>
+            <w:r/>
+            <w:r>
+              <w:rPr>
+                <w:sz w:val="18"/>
+              </w:rPr>
+              <w:t>Отмена записи после оговорки</w:t>
+            </w:r>
+          </w:p>
+        </w:tc>
+        <w:tc>
+          <w:tcPr>
+            <w:tcW w:type="dxa" w:w="1587"/>
+          </w:tcPr>
+          <w:p>
+            <w:pPr>
+              <w:spacing w:after="20"/>
+            </w:pPr>
+            <w:r/>
+            <w:r>
+              <w:rPr>
+                <w:sz w:val="18"/>
+              </w:rPr>
+              <w:t>Открыт разговор, «Ваш ход»</w:t>
+            </w:r>
+          </w:p>
+        </w:tc>
+        <w:tc>
+          <w:tcPr>
+            <w:tcW w:type="dxa" w:w="3061"/>
+          </w:tcPr>
+          <w:p>
+            <w:pPr>
+              <w:spacing w:after="20"/>
+            </w:pPr>
+            <w:r/>
+            <w:r>
+              <w:rPr>
+                <w:sz w:val="18"/>
+              </w:rPr>
+              <w:t>1. Нажать микрофон, сказать что-нибудь и оговориться</w:t>
+            </w:r>
+          </w:p>
+          <w:p>
+            <w:pPr>
+              <w:spacing w:after="20"/>
+            </w:pPr>
+            <w:r>
+              <w:rPr>
+                <w:sz w:val="18"/>
+              </w:rPr>
+              <w:t>2. Нажать «Отменить» под микрофоном</w:t>
+            </w:r>
+          </w:p>
+          <w:p>
+            <w:pPr>
+              <w:spacing w:after="20"/>
+            </w:pPr>
+            <w:r>
+              <w:rPr>
+                <w:sz w:val="18"/>
+              </w:rPr>
+              <w:t>3. Нажать микрофон снова, сказать реплику и дождаться конца записи</w:t>
+            </w:r>
+          </w:p>
+        </w:tc>
+        <w:tc>
+          <w:tcPr>
+            <w:tcW w:type="dxa" w:w="2381"/>
+          </w:tcPr>
+          <w:p>
+            <w:pPr>
+              <w:spacing w:after="20"/>
+            </w:pPr>
+            <w:r/>
+            <w:r>
+              <w:rPr>
+                <w:sz w:val="18"/>
+              </w:rPr>
+              <w:t>Во время записи под микрофоном вместо подсказки есть «Отменить». После нажатия запись останавливается, серый транскрипт исчезает, бадди ничего не отвечает, док «Ваш ход». Вторая запись уходит бадди как обычно, без дополнительных кнопок</w:t>
+            </w:r>
+          </w:p>
+        </w:tc>
+        <w:tc>
+          <w:tcPr>
+            <w:tcW w:type="dxa" w:w="794"/>
+          </w:tcPr>
+          <w:p>
+            <w:pPr>
+              <w:spacing w:after="20"/>
+            </w:pPr>
+            <w:r/>
+            <w:r>
+              <w:rPr>
+                <w:sz w:val="18"/>
+              </w:rPr>
+              <w:t>☐ PASS</w:t>
+              <w:br/>
+              <w:t>☐ FAIL</w:t>
+            </w:r>
+          </w:p>
+        </w:tc>
+      </w:tr>
+      <w:tr>
+        <w:tc>
+          <w:tcPr>
+            <w:tcW w:type="dxa" w:w="794"/>
+          </w:tcPr>
+          <w:p>
+            <w:pPr>
+              <w:spacing w:after="20"/>
+            </w:pPr>
+            <w:r/>
+            <w:r>
+              <w:rPr>
+                <w:sz w:val="18"/>
+              </w:rPr>
+              <w:t>M-19</w:t>
+            </w:r>
+          </w:p>
+        </w:tc>
+        <w:tc>
+          <w:tcPr>
+            <w:tcW w:type="dxa" w:w="1587"/>
+          </w:tcPr>
+          <w:p>
+            <w:pPr>
+              <w:spacing w:after="20"/>
+            </w:pPr>
+            <w:r/>
+            <w:r>
+              <w:rPr>
+                <w:sz w:val="18"/>
+              </w:rPr>
+              <w:t>Поправка с объяснением</w:t>
+            </w:r>
+          </w:p>
+        </w:tc>
+        <w:tc>
+          <w:tcPr>
+            <w:tcW w:type="dxa" w:w="1587"/>
+          </w:tcPr>
+          <w:p>
+            <w:pPr>
+              <w:spacing w:after="20"/>
+            </w:pPr>
+            <w:r/>
+            <w:r>
+              <w:rPr>
+                <w:sz w:val="18"/>
+              </w:rPr>
+              <w:t>Языковой предмет, разговор</w:t>
+            </w:r>
+          </w:p>
+        </w:tc>
+        <w:tc>
+          <w:tcPr>
+            <w:tcW w:type="dxa" w:w="3061"/>
+          </w:tcPr>
+          <w:p>
+            <w:pPr>
+              <w:spacing w:after="20"/>
+            </w:pPr>
+            <w:r/>
+            <w:r>
+              <w:rPr>
+                <w:sz w:val="18"/>
+              </w:rPr>
+              <w:t>1. Ответить с ошибкой (например, «I work in a bank»)</w:t>
+            </w:r>
+          </w:p>
+          <w:p>
+            <w:pPr>
+              <w:spacing w:after="20"/>
+            </w:pPr>
+            <w:r>
+              <w:rPr>
+                <w:sz w:val="18"/>
+              </w:rPr>
+              <w:t>2. Прочитать текст поправки и послушать голос</w:t>
+            </w:r>
+          </w:p>
+        </w:tc>
+        <w:tc>
+          <w:tcPr>
+            <w:tcW w:type="dxa" w:w="2381"/>
+          </w:tcPr>
+          <w:p>
+            <w:pPr>
+              <w:spacing w:after="20"/>
+            </w:pPr>
+            <w:r/>
+            <w:r>
+              <w:rPr>
+                <w:sz w:val="18"/>
+              </w:rPr>
+              <w:t>Бадди поправляет и в той же реплике одной фразой объясняет, почему так правильно (правило), по-русски в тексте и коротко на языке предмета вслух; затем просит повторить или продолжить</w:t>
             </w:r>
           </w:p>
         </w:tc>

</xml_diff>

<commit_message>
QA docs: section 5.13 applies from build 22
Co-Authored-By: Claude Fable 5.1 <noreply@anthropic.com>
</commit_message>
<xml_diff>
--- a/docs/qa/Teach — тестовая документация QA.docx
+++ b/docs/qa/Teach — тестовая документация QA.docx
@@ -147,7 +147,7 @@
               <w:rPr>
                 <w:sz w:val="19"/>
               </w:rPr>
-              <w:t>Teach 0.1.0, build 20 в TestFlight (или новее — номер build указывайте в bug report)</w:t>
+              <w:t>Teach 0.1.0, build 22 в TestFlight (или новее — номер build указывайте в bug report)</w:t>
             </w:r>
           </w:p>
         </w:tc>
@@ -12993,7 +12993,7 @@
           <w:b w:val="0"/>
           <w:i w:val="0"/>
         </w:rPr>
-        <w:t>Раздел действует начиная со сборки 20 (FRD: FR-66…68, SR-16). В bug report указывайте номер build. Разговор идёт так: платформенное распознавание → текст на сервер → ответ бадди озвучивается системным голосом. Бадди обращается на «ты» — это характер персонажа, не bug. M-12 пропускается, пока не реализован FR-68.</w:t>
+        <w:t>Раздел действует начиная со сборки 22 (FRD: FR-66…68, SR-16). В bug report указывайте номер build. Разговор идёт так: платформенное распознавание → текст на сервер → ответ бадди озвучивается системным голосом. Бадди обращается на «ты» — это характер персонажа, не bug. M-12 пропускается, пока не реализован FR-68.</w:t>
       </w:r>
     </w:p>
     <w:tbl>

</xml_diff>